<commit_message>
Finished GameIO, and implemented passive abilities in Player class
Also fixed a few warnings in Player. I had to mess with GameObject and Model to incorporate abilities like player size and attack speed.
</commit_message>
<xml_diff>
--- a/Archimedean.docx
+++ b/Archimedean.docx
@@ -924,7 +924,7 @@
           <w:u w:val="single"/>
           <w:lang w:val="en-US"/>
         </w:rPr>
-        <w:t>Lab Questions:</w:t>
+        <w:t>Current Steps:</w:t>
       </w:r>
     </w:p>
     <w:p>
@@ -948,25 +948,7 @@
           <w:szCs w:val="24"/>
           <w:lang w:val="en-US"/>
         </w:rPr>
-        <w:t xml:space="preserve">Why use </w:t>
-      </w:r>
-      <w:r>
-        <w:rPr>
-          <w:rFonts w:ascii="Times New Roman" w:hAnsi="Times New Roman" w:cs="Times New Roman"/>
-          <w:sz w:val="24"/>
-          <w:szCs w:val="24"/>
-          <w:lang w:val="en-US"/>
-        </w:rPr>
-        <w:t>CopyOnWriteArrayList</w:t>
-      </w:r>
-      <w:r>
-        <w:rPr>
-          <w:rFonts w:ascii="Times New Roman" w:hAnsi="Times New Roman" w:cs="Times New Roman"/>
-          <w:sz w:val="24"/>
-          <w:szCs w:val="24"/>
-          <w:lang w:val="en-US"/>
-        </w:rPr>
-        <w:t>&lt;&gt; in Model?</w:t>
+        <w:t>Create methods for special abilities</w:t>
       </w:r>
     </w:p>
     <w:p>
@@ -983,6 +965,63 @@
           <w:lang w:val="en-US"/>
         </w:rPr>
       </w:pPr>
+      <w:r>
+        <w:rPr>
+          <w:rFonts w:ascii="Times New Roman" w:hAnsi="Times New Roman" w:cs="Times New Roman"/>
+          <w:sz w:val="24"/>
+          <w:szCs w:val="24"/>
+          <w:lang w:val="en-US"/>
+        </w:rPr>
+        <w:t>Create system that adds upgrades to player</w:t>
+      </w:r>
+    </w:p>
+    <w:p>
+      <w:pPr>
+        <w:pStyle w:val="ListParagraph"/>
+        <w:numPr>
+          <w:ilvl w:val="0"/>
+          <w:numId w:val="2"/>
+        </w:numPr>
+        <w:rPr>
+          <w:rFonts w:ascii="Times New Roman" w:hAnsi="Times New Roman" w:cs="Times New Roman"/>
+          <w:sz w:val="24"/>
+          <w:szCs w:val="24"/>
+          <w:lang w:val="en-US"/>
+        </w:rPr>
+      </w:pPr>
+      <w:r>
+        <w:rPr>
+          <w:rFonts w:ascii="Times New Roman" w:hAnsi="Times New Roman" w:cs="Times New Roman"/>
+          <w:sz w:val="24"/>
+          <w:szCs w:val="24"/>
+          <w:lang w:val="en-US"/>
+        </w:rPr>
+        <w:t>Make model call player level-ups</w:t>
+      </w:r>
+    </w:p>
+    <w:p>
+      <w:pPr>
+        <w:pStyle w:val="ListParagraph"/>
+        <w:numPr>
+          <w:ilvl w:val="0"/>
+          <w:numId w:val="2"/>
+        </w:numPr>
+        <w:rPr>
+          <w:rFonts w:ascii="Times New Roman" w:hAnsi="Times New Roman" w:cs="Times New Roman"/>
+          <w:sz w:val="24"/>
+          <w:szCs w:val="24"/>
+          <w:lang w:val="en-US"/>
+        </w:rPr>
+      </w:pPr>
+      <w:r>
+        <w:rPr>
+          <w:rFonts w:ascii="Times New Roman" w:hAnsi="Times New Roman" w:cs="Times New Roman"/>
+          <w:sz w:val="24"/>
+          <w:szCs w:val="24"/>
+          <w:lang w:val="en-US"/>
+        </w:rPr>
+        <w:t>Make viewer or mainwindow show a popup asking between two currently unpicked skills</w:t>
+      </w:r>
     </w:p>
     <w:sectPr>
       <w:pgSz w:w="11906" w:h="16838"/>
@@ -1220,11 +1259,127 @@
       </w:rPr>
     </w:lvl>
   </w:abstractNum>
+  <w:abstractNum w:abstractNumId="2" w15:restartNumberingAfterBreak="0">
+    <w:nsid w:val="654710CD"/>
+    <w:multiLevelType w:val="hybridMultilevel"/>
+    <w:tmpl w:val="6F9C2B34"/>
+    <w:lvl w:ilvl="0" w:tplc="18090001">
+      <w:start w:val="1"/>
+      <w:numFmt w:val="bullet"/>
+      <w:lvlText w:val=""/>
+      <w:lvlJc w:val="left"/>
+      <w:pPr>
+        <w:ind w:left="360" w:hanging="360"/>
+      </w:pPr>
+      <w:rPr>
+        <w:rFonts w:ascii="Symbol" w:hAnsi="Symbol" w:hint="default"/>
+      </w:rPr>
+    </w:lvl>
+    <w:lvl w:ilvl="1" w:tplc="18090003" w:tentative="1">
+      <w:start w:val="1"/>
+      <w:numFmt w:val="bullet"/>
+      <w:lvlText w:val="o"/>
+      <w:lvlJc w:val="left"/>
+      <w:pPr>
+        <w:ind w:left="1080" w:hanging="360"/>
+      </w:pPr>
+      <w:rPr>
+        <w:rFonts w:ascii="Courier New" w:hAnsi="Courier New" w:cs="Courier New" w:hint="default"/>
+      </w:rPr>
+    </w:lvl>
+    <w:lvl w:ilvl="2" w:tplc="18090005" w:tentative="1">
+      <w:start w:val="1"/>
+      <w:numFmt w:val="bullet"/>
+      <w:lvlText w:val=""/>
+      <w:lvlJc w:val="left"/>
+      <w:pPr>
+        <w:ind w:left="1800" w:hanging="360"/>
+      </w:pPr>
+      <w:rPr>
+        <w:rFonts w:ascii="Wingdings" w:hAnsi="Wingdings" w:hint="default"/>
+      </w:rPr>
+    </w:lvl>
+    <w:lvl w:ilvl="3" w:tplc="18090001" w:tentative="1">
+      <w:start w:val="1"/>
+      <w:numFmt w:val="bullet"/>
+      <w:lvlText w:val=""/>
+      <w:lvlJc w:val="left"/>
+      <w:pPr>
+        <w:ind w:left="2520" w:hanging="360"/>
+      </w:pPr>
+      <w:rPr>
+        <w:rFonts w:ascii="Symbol" w:hAnsi="Symbol" w:hint="default"/>
+      </w:rPr>
+    </w:lvl>
+    <w:lvl w:ilvl="4" w:tplc="18090003" w:tentative="1">
+      <w:start w:val="1"/>
+      <w:numFmt w:val="bullet"/>
+      <w:lvlText w:val="o"/>
+      <w:lvlJc w:val="left"/>
+      <w:pPr>
+        <w:ind w:left="3240" w:hanging="360"/>
+      </w:pPr>
+      <w:rPr>
+        <w:rFonts w:ascii="Courier New" w:hAnsi="Courier New" w:cs="Courier New" w:hint="default"/>
+      </w:rPr>
+    </w:lvl>
+    <w:lvl w:ilvl="5" w:tplc="18090005" w:tentative="1">
+      <w:start w:val="1"/>
+      <w:numFmt w:val="bullet"/>
+      <w:lvlText w:val=""/>
+      <w:lvlJc w:val="left"/>
+      <w:pPr>
+        <w:ind w:left="3960" w:hanging="360"/>
+      </w:pPr>
+      <w:rPr>
+        <w:rFonts w:ascii="Wingdings" w:hAnsi="Wingdings" w:hint="default"/>
+      </w:rPr>
+    </w:lvl>
+    <w:lvl w:ilvl="6" w:tplc="18090001" w:tentative="1">
+      <w:start w:val="1"/>
+      <w:numFmt w:val="bullet"/>
+      <w:lvlText w:val=""/>
+      <w:lvlJc w:val="left"/>
+      <w:pPr>
+        <w:ind w:left="4680" w:hanging="360"/>
+      </w:pPr>
+      <w:rPr>
+        <w:rFonts w:ascii="Symbol" w:hAnsi="Symbol" w:hint="default"/>
+      </w:rPr>
+    </w:lvl>
+    <w:lvl w:ilvl="7" w:tplc="18090003" w:tentative="1">
+      <w:start w:val="1"/>
+      <w:numFmt w:val="bullet"/>
+      <w:lvlText w:val="o"/>
+      <w:lvlJc w:val="left"/>
+      <w:pPr>
+        <w:ind w:left="5400" w:hanging="360"/>
+      </w:pPr>
+      <w:rPr>
+        <w:rFonts w:ascii="Courier New" w:hAnsi="Courier New" w:cs="Courier New" w:hint="default"/>
+      </w:rPr>
+    </w:lvl>
+    <w:lvl w:ilvl="8" w:tplc="18090005" w:tentative="1">
+      <w:start w:val="1"/>
+      <w:numFmt w:val="bullet"/>
+      <w:lvlText w:val=""/>
+      <w:lvlJc w:val="left"/>
+      <w:pPr>
+        <w:ind w:left="6120" w:hanging="360"/>
+      </w:pPr>
+      <w:rPr>
+        <w:rFonts w:ascii="Wingdings" w:hAnsi="Wingdings" w:hint="default"/>
+      </w:rPr>
+    </w:lvl>
+  </w:abstractNum>
   <w:num w:numId="1" w16cid:durableId="1416434656">
     <w:abstractNumId w:val="1"/>
   </w:num>
   <w:num w:numId="2" w16cid:durableId="496699704">
     <w:abstractNumId w:val="0"/>
+  </w:num>
+  <w:num w:numId="3" w16cid:durableId="1517421600">
+    <w:abstractNumId w:val="2"/>
   </w:num>
 </w:numbering>
 </file>

</xml_diff>

<commit_message>
Final submit before turning in the project!
I wasn't able to add some featues in the end, but I think that's okay, the game is fun to play, challenging, and looks good. I'm happy with it.
</commit_message>
<xml_diff>
--- a/Archimedean.docx
+++ b/Archimedean.docx
@@ -24,109 +24,261 @@
     </w:p>
     <w:p>
       <w:pPr>
-        <w:rPr>
-          <w:rFonts w:ascii="Times New Roman" w:hAnsi="Times New Roman" w:cs="Times New Roman"/>
-          <w:sz w:val="24"/>
-          <w:szCs w:val="24"/>
-          <w:u w:val="single"/>
-          <w:lang w:val="en-US"/>
-        </w:rPr>
-      </w:pPr>
-      <w:r>
-        <w:rPr>
-          <w:rFonts w:ascii="Times New Roman" w:hAnsi="Times New Roman" w:cs="Times New Roman"/>
-          <w:sz w:val="24"/>
-          <w:szCs w:val="24"/>
-          <w:u w:val="single"/>
-          <w:lang w:val="en-US"/>
-        </w:rPr>
-        <w:t>Project Plan</w:t>
-      </w:r>
-      <w:r>
-        <w:rPr>
-          <w:rFonts w:ascii="Times New Roman" w:hAnsi="Times New Roman" w:cs="Times New Roman"/>
-          <w:sz w:val="24"/>
-          <w:szCs w:val="24"/>
-          <w:u w:val="single"/>
-          <w:lang w:val="en-US"/>
-        </w:rPr>
-        <w:t>:</w:t>
-      </w:r>
-    </w:p>
-    <w:p>
-      <w:pPr>
-        <w:rPr>
-          <w:rFonts w:ascii="Times New Roman" w:hAnsi="Times New Roman" w:cs="Times New Roman"/>
-          <w:sz w:val="24"/>
-          <w:szCs w:val="24"/>
-          <w:lang w:val="en-US"/>
-        </w:rPr>
-      </w:pPr>
-      <w:r>
-        <w:rPr>
-          <w:rFonts w:ascii="Times New Roman" w:hAnsi="Times New Roman" w:cs="Times New Roman"/>
-          <w:sz w:val="24"/>
-          <w:szCs w:val="24"/>
-          <w:lang w:val="en-US"/>
-        </w:rPr>
-        <w:t xml:space="preserve">Main </w:t>
-      </w:r>
-      <w:r>
-        <w:rPr>
-          <w:rFonts w:ascii="Times New Roman" w:hAnsi="Times New Roman" w:cs="Times New Roman"/>
-          <w:sz w:val="24"/>
-          <w:szCs w:val="24"/>
-          <w:lang w:val="en-US"/>
-        </w:rPr>
-        <w:t>Game Idea:</w:t>
-      </w:r>
-      <w:r>
-        <w:rPr>
-          <w:rFonts w:ascii="Times New Roman" w:hAnsi="Times New Roman" w:cs="Times New Roman"/>
-          <w:sz w:val="24"/>
-          <w:szCs w:val="24"/>
-          <w:lang w:val="en-US"/>
-        </w:rPr>
-        <w:t xml:space="preserve"> A roguelike (shocker) 2D platform / shooter hybrid. As the idea develops in my mind it resembles something like Risk of Rain or </w:t>
-      </w:r>
-      <w:r>
-        <w:rPr>
-          <w:rFonts w:ascii="Times New Roman" w:hAnsi="Times New Roman" w:cs="Times New Roman"/>
-          <w:sz w:val="24"/>
-          <w:szCs w:val="24"/>
-          <w:lang w:val="en-US"/>
-        </w:rPr>
-        <w:t>Warlocks vs Shadows.</w:t>
-      </w:r>
-      <w:r>
-        <w:rPr>
-          <w:rFonts w:ascii="Times New Roman" w:hAnsi="Times New Roman" w:cs="Times New Roman"/>
-          <w:sz w:val="24"/>
-          <w:szCs w:val="24"/>
-          <w:lang w:val="en-US"/>
-        </w:rPr>
-        <w:t xml:space="preserve"> The source of the name comes from an extra bit of movement tech I would like to integrate. Here are the main gameplay features and loops:</w:t>
-      </w:r>
-    </w:p>
-    <w:p>
-      <w:pPr>
-        <w:rPr>
-          <w:rFonts w:ascii="Times New Roman" w:hAnsi="Times New Roman" w:cs="Times New Roman"/>
-          <w:sz w:val="24"/>
-          <w:szCs w:val="24"/>
-          <w:u w:val="single"/>
-          <w:lang w:val="en-US"/>
-        </w:rPr>
-      </w:pPr>
-      <w:r>
-        <w:rPr>
-          <w:rFonts w:ascii="Times New Roman" w:hAnsi="Times New Roman" w:cs="Times New Roman"/>
-          <w:sz w:val="24"/>
-          <w:szCs w:val="24"/>
-          <w:u w:val="single"/>
-          <w:lang w:val="en-US"/>
-        </w:rPr>
-        <w:t>Features:</w:t>
+        <w:jc w:val="both"/>
+        <w:rPr>
+          <w:rFonts w:ascii="Times New Roman" w:hAnsi="Times New Roman" w:cs="Times New Roman"/>
+          <w:sz w:val="24"/>
+          <w:szCs w:val="24"/>
+          <w:lang w:val="en-US"/>
+        </w:rPr>
+      </w:pPr>
+      <w:r>
+        <w:rPr>
+          <w:rFonts w:ascii="Times New Roman" w:hAnsi="Times New Roman" w:cs="Times New Roman"/>
+          <w:sz w:val="24"/>
+          <w:szCs w:val="24"/>
+          <w:lang w:val="en-US"/>
+        </w:rPr>
+        <w:tab/>
+        <w:t>I am going to briefly go over some of the key features, scrapped features, accomplishments, and controls for the game “Archimedean” made by me, Ryan Koenig, using a base template provided by Abey Campbell and sprites from various amazing Itch.io authors, linked at the bottom.</w:t>
+      </w:r>
+    </w:p>
+    <w:p>
+      <w:pPr>
+        <w:jc w:val="center"/>
+        <w:rPr>
+          <w:rFonts w:ascii="Times New Roman" w:hAnsi="Times New Roman" w:cs="Times New Roman"/>
+          <w:sz w:val="24"/>
+          <w:szCs w:val="24"/>
+          <w:lang w:val="en-US"/>
+        </w:rPr>
+      </w:pPr>
+      <w:r>
+        <w:rPr>
+          <w:rFonts w:ascii="Times New Roman" w:hAnsi="Times New Roman" w:cs="Times New Roman"/>
+          <w:sz w:val="24"/>
+          <w:szCs w:val="24"/>
+          <w:lang w:val="en-US"/>
+        </w:rPr>
+        <w:t>Overview</w:t>
+      </w:r>
+    </w:p>
+    <w:p>
+      <w:pPr>
+        <w:jc w:val="both"/>
+        <w:rPr>
+          <w:rFonts w:ascii="Times New Roman" w:hAnsi="Times New Roman" w:cs="Times New Roman"/>
+          <w:sz w:val="24"/>
+          <w:szCs w:val="24"/>
+          <w:lang w:val="en-US"/>
+        </w:rPr>
+      </w:pPr>
+      <w:r>
+        <w:rPr>
+          <w:rFonts w:ascii="Times New Roman" w:hAnsi="Times New Roman" w:cs="Times New Roman"/>
+          <w:sz w:val="24"/>
+          <w:szCs w:val="24"/>
+          <w:lang w:val="en-US"/>
+        </w:rPr>
+        <w:tab/>
+        <w:t>The main idea for the game was a 2D side-scrolling platformer, shooter, and roguelike like Risk of Rain. I initially had the idea of the player having a whip and being able to swing between platforms like Indiana Jones, however given the limitations of doing this without an engine and in java, that proved to be a challenge beyond the scope of this project. The rest of it stuck though, and eventually Archimedean developed into how I imagine the first draft of Risk of Rain may have looked.</w:t>
+      </w:r>
+    </w:p>
+    <w:p>
+      <w:pPr>
+        <w:jc w:val="both"/>
+        <w:rPr>
+          <w:rFonts w:ascii="Times New Roman" w:hAnsi="Times New Roman" w:cs="Times New Roman"/>
+          <w:sz w:val="24"/>
+          <w:szCs w:val="24"/>
+          <w:lang w:val="en-US"/>
+        </w:rPr>
+      </w:pPr>
+      <w:r>
+        <w:rPr>
+          <w:rFonts w:ascii="Times New Roman" w:hAnsi="Times New Roman" w:cs="Times New Roman"/>
+          <w:sz w:val="24"/>
+          <w:szCs w:val="24"/>
+          <w:lang w:val="en-US"/>
+        </w:rPr>
+        <w:tab/>
+        <w:t>The art style is inspired by a game called Warlocks vs Shadows, which is a game very similar to this one and RoR. Even if you haven’t seen the game, you can clearly see the influence in my sprites just from the name. The background is an exception, where it is a simple sky image that progressively becomes night. I liked how this makes it slightly harder to see enemies and projectiles, making you have to be better at managing enemies and dodging.</w:t>
+      </w:r>
+    </w:p>
+    <w:p>
+      <w:pPr>
+        <w:jc w:val="center"/>
+        <w:rPr>
+          <w:rFonts w:ascii="Times New Roman" w:hAnsi="Times New Roman" w:cs="Times New Roman"/>
+          <w:sz w:val="24"/>
+          <w:szCs w:val="24"/>
+          <w:lang w:val="en-US"/>
+        </w:rPr>
+      </w:pPr>
+      <w:r>
+        <w:rPr>
+          <w:rFonts w:ascii="Times New Roman" w:hAnsi="Times New Roman" w:cs="Times New Roman"/>
+          <w:sz w:val="24"/>
+          <w:szCs w:val="24"/>
+          <w:lang w:val="en-US"/>
+        </w:rPr>
+        <w:t>Features and Controls:</w:t>
+      </w:r>
+      <w:r>
+        <w:rPr>
+          <w:noProof/>
+        </w:rPr>
+        <w:t xml:space="preserve"> </w:t>
+      </w:r>
+    </w:p>
+    <w:p>
+      <w:pPr>
+        <w:jc w:val="both"/>
+        <w:rPr>
+          <w:rFonts w:ascii="Times New Roman" w:hAnsi="Times New Roman" w:cs="Times New Roman"/>
+          <w:sz w:val="24"/>
+          <w:szCs w:val="24"/>
+          <w:lang w:val="en-US"/>
+        </w:rPr>
+      </w:pPr>
+      <w:r>
+        <w:rPr>
+          <w:rFonts w:ascii="Times New Roman" w:hAnsi="Times New Roman" w:cs="Times New Roman"/>
+          <w:sz w:val="24"/>
+          <w:szCs w:val="24"/>
+          <w:lang w:val="en-US"/>
+        </w:rPr>
+        <w:drawing>
+          <wp:anchor distT="0" distB="0" distL="114300" distR="114300" simplePos="0" relativeHeight="251658240" behindDoc="0" locked="0" layoutInCell="1" allowOverlap="1" wp14:anchorId="36C71206" wp14:editId="6EC1ADDE">
+            <wp:simplePos x="0" y="0"/>
+            <wp:positionH relativeFrom="margin">
+              <wp:posOffset>2424430</wp:posOffset>
+            </wp:positionH>
+            <wp:positionV relativeFrom="paragraph">
+              <wp:posOffset>160655</wp:posOffset>
+            </wp:positionV>
+            <wp:extent cx="3307080" cy="2120900"/>
+            <wp:effectExtent l="0" t="0" r="7620" b="0"/>
+            <wp:wrapSquare wrapText="bothSides"/>
+            <wp:docPr id="1651309668" name="Picture 1"/>
+            <wp:cNvGraphicFramePr>
+              <a:graphicFrameLocks xmlns:a="http://schemas.openxmlformats.org/drawingml/2006/main" noChangeAspect="1"/>
+            </wp:cNvGraphicFramePr>
+            <a:graphic xmlns:a="http://schemas.openxmlformats.org/drawingml/2006/main">
+              <a:graphicData uri="http://schemas.openxmlformats.org/drawingml/2006/picture">
+                <pic:pic xmlns:pic="http://schemas.openxmlformats.org/drawingml/2006/picture">
+                  <pic:nvPicPr>
+                    <pic:cNvPr id="1651309668" name=""/>
+                    <pic:cNvPicPr/>
+                  </pic:nvPicPr>
+                  <pic:blipFill>
+                    <a:blip r:embed="rId5" cstate="print">
+                      <a:extLst>
+                        <a:ext uri="{28A0092B-C50C-407E-A947-70E740481C1C}">
+                          <a14:useLocalDpi xmlns:a14="http://schemas.microsoft.com/office/drawing/2010/main" val="0"/>
+                        </a:ext>
+                      </a:extLst>
+                    </a:blip>
+                    <a:stretch>
+                      <a:fillRect/>
+                    </a:stretch>
+                  </pic:blipFill>
+                  <pic:spPr>
+                    <a:xfrm>
+                      <a:off x="0" y="0"/>
+                      <a:ext cx="3307080" cy="2120900"/>
+                    </a:xfrm>
+                    <a:prstGeom prst="rect">
+                      <a:avLst/>
+                    </a:prstGeom>
+                  </pic:spPr>
+                </pic:pic>
+              </a:graphicData>
+            </a:graphic>
+            <wp14:sizeRelH relativeFrom="margin">
+              <wp14:pctWidth>0</wp14:pctWidth>
+            </wp14:sizeRelH>
+            <wp14:sizeRelV relativeFrom="margin">
+              <wp14:pctHeight>0</wp14:pctHeight>
+            </wp14:sizeRelV>
+          </wp:anchor>
+        </w:drawing>
+      </w:r>
+      <w:r>
+        <w:rPr>
+          <w:rFonts w:ascii="Times New Roman" w:hAnsi="Times New Roman" w:cs="Times New Roman"/>
+          <w:sz w:val="24"/>
+          <w:szCs w:val="24"/>
+          <w:lang w:val="en-US"/>
+        </w:rPr>
+        <w:t>A basic attack through means of the left mouse button</w:t>
+      </w:r>
+    </w:p>
+    <w:p>
+      <w:pPr>
+        <w:jc w:val="both"/>
+        <w:rPr>
+          <w:rFonts w:ascii="Times New Roman" w:hAnsi="Times New Roman" w:cs="Times New Roman"/>
+          <w:sz w:val="24"/>
+          <w:szCs w:val="24"/>
+          <w:lang w:val="en-US"/>
+        </w:rPr>
+      </w:pPr>
+      <w:r>
+        <w:rPr>
+          <w:rFonts w:ascii="Times New Roman" w:hAnsi="Times New Roman" w:cs="Times New Roman"/>
+          <w:sz w:val="24"/>
+          <w:szCs w:val="24"/>
+          <w:lang w:val="en-US"/>
+        </w:rPr>
+        <w:t>Jumping through W, alongside gravity</w:t>
+      </w:r>
+      <w:r>
+        <w:rPr>
+          <w:rFonts w:ascii="Times New Roman" w:hAnsi="Times New Roman" w:cs="Times New Roman"/>
+          <w:sz w:val="24"/>
+          <w:szCs w:val="24"/>
+          <w:lang w:val="en-US"/>
+        </w:rPr>
+        <w:t>, which requires</w:t>
+      </w:r>
+      <w:r>
+        <w:rPr>
+          <w:rFonts w:ascii="Times New Roman" w:hAnsi="Times New Roman" w:cs="Times New Roman"/>
+          <w:sz w:val="24"/>
+          <w:szCs w:val="24"/>
+          <w:lang w:val="en-US"/>
+        </w:rPr>
+        <w:t xml:space="preserve"> collision with platforms. The “collision” in the template was very simple, and I developed Model.collisionDetector() as a better collision check.</w:t>
+      </w:r>
+    </w:p>
+    <w:p>
+      <w:pPr>
+        <w:jc w:val="both"/>
+        <w:rPr>
+          <w:rFonts w:ascii="Times New Roman" w:hAnsi="Times New Roman" w:cs="Times New Roman"/>
+          <w:sz w:val="24"/>
+          <w:szCs w:val="24"/>
+          <w:lang w:val="en-US"/>
+        </w:rPr>
+      </w:pPr>
+      <w:r>
+        <w:rPr>
+          <w:rFonts w:ascii="Times New Roman" w:hAnsi="Times New Roman" w:cs="Times New Roman"/>
+          <w:sz w:val="24"/>
+          <w:szCs w:val="24"/>
+          <w:lang w:val="en-US"/>
+        </w:rPr>
+        <w:t>S</w:t>
+      </w:r>
+      <w:r>
+        <w:rPr>
+          <w:rFonts w:ascii="Times New Roman" w:hAnsi="Times New Roman" w:cs="Times New Roman"/>
+          <w:sz w:val="24"/>
+          <w:szCs w:val="24"/>
+          <w:lang w:val="en-US"/>
+        </w:rPr>
+        <w:t>kills earned through progression through the game, chosen from a set of options, activated through Q, E</w:t>
       </w:r>
     </w:p>
     <w:p>
@@ -134,23 +286,182 @@
         <w:pStyle w:val="ListParagraph"/>
         <w:numPr>
           <w:ilvl w:val="0"/>
-          <w:numId w:val="2"/>
+          <w:numId w:val="4"/>
         </w:numPr>
-        <w:rPr>
-          <w:rFonts w:ascii="Times New Roman" w:hAnsi="Times New Roman" w:cs="Times New Roman"/>
-          <w:sz w:val="24"/>
-          <w:szCs w:val="24"/>
-          <w:lang w:val="en-US"/>
-        </w:rPr>
-      </w:pPr>
-      <w:r>
-        <w:rPr>
-          <w:rFonts w:ascii="Times New Roman" w:hAnsi="Times New Roman" w:cs="Times New Roman"/>
-          <w:sz w:val="24"/>
-          <w:szCs w:val="24"/>
-          <w:lang w:val="en-US"/>
-        </w:rPr>
-        <w:t>A basic attack through means of the left mouse button</w:t>
+        <w:jc w:val="both"/>
+        <w:rPr>
+          <w:rFonts w:ascii="Times New Roman" w:hAnsi="Times New Roman" w:cs="Times New Roman"/>
+          <w:sz w:val="24"/>
+          <w:szCs w:val="24"/>
+          <w:lang w:val="en-US"/>
+        </w:rPr>
+      </w:pPr>
+      <w:r>
+        <w:rPr>
+          <w:rFonts w:ascii="Times New Roman" w:hAnsi="Times New Roman" w:cs="Times New Roman"/>
+          <w:sz w:val="24"/>
+          <w:szCs w:val="24"/>
+          <w:lang w:val="en-US"/>
+        </w:rPr>
+        <w:drawing>
+          <wp:anchor distT="0" distB="0" distL="114300" distR="114300" simplePos="0" relativeHeight="251659264" behindDoc="0" locked="0" layoutInCell="1" allowOverlap="1" wp14:anchorId="54EFF595" wp14:editId="548789E3">
+            <wp:simplePos x="0" y="0"/>
+            <wp:positionH relativeFrom="margin">
+              <wp:align>right</wp:align>
+            </wp:positionH>
+            <wp:positionV relativeFrom="paragraph">
+              <wp:posOffset>5715</wp:posOffset>
+            </wp:positionV>
+            <wp:extent cx="3354070" cy="2150110"/>
+            <wp:effectExtent l="0" t="0" r="0" b="2540"/>
+            <wp:wrapSquare wrapText="bothSides"/>
+            <wp:docPr id="919829155" name="Picture 1"/>
+            <wp:cNvGraphicFramePr>
+              <a:graphicFrameLocks xmlns:a="http://schemas.openxmlformats.org/drawingml/2006/main" noChangeAspect="1"/>
+            </wp:cNvGraphicFramePr>
+            <a:graphic xmlns:a="http://schemas.openxmlformats.org/drawingml/2006/main">
+              <a:graphicData uri="http://schemas.openxmlformats.org/drawingml/2006/picture">
+                <pic:pic xmlns:pic="http://schemas.openxmlformats.org/drawingml/2006/picture">
+                  <pic:nvPicPr>
+                    <pic:cNvPr id="919829155" name=""/>
+                    <pic:cNvPicPr/>
+                  </pic:nvPicPr>
+                  <pic:blipFill>
+                    <a:blip r:embed="rId6" cstate="print">
+                      <a:extLst>
+                        <a:ext uri="{28A0092B-C50C-407E-A947-70E740481C1C}">
+                          <a14:useLocalDpi xmlns:a14="http://schemas.microsoft.com/office/drawing/2010/main" val="0"/>
+                        </a:ext>
+                      </a:extLst>
+                    </a:blip>
+                    <a:stretch>
+                      <a:fillRect/>
+                    </a:stretch>
+                  </pic:blipFill>
+                  <pic:spPr>
+                    <a:xfrm>
+                      <a:off x="0" y="0"/>
+                      <a:ext cx="3354070" cy="2150110"/>
+                    </a:xfrm>
+                    <a:prstGeom prst="rect">
+                      <a:avLst/>
+                    </a:prstGeom>
+                  </pic:spPr>
+                </pic:pic>
+              </a:graphicData>
+            </a:graphic>
+            <wp14:sizeRelH relativeFrom="margin">
+              <wp14:pctWidth>0</wp14:pctWidth>
+            </wp14:sizeRelH>
+            <wp14:sizeRelV relativeFrom="margin">
+              <wp14:pctHeight>0</wp14:pctHeight>
+            </wp14:sizeRelV>
+          </wp:anchor>
+        </w:drawing>
+      </w:r>
+      <w:r>
+        <w:rPr>
+          <w:rFonts w:ascii="Times New Roman" w:hAnsi="Times New Roman" w:cs="Times New Roman"/>
+          <w:sz w:val="24"/>
+          <w:szCs w:val="24"/>
+          <w:lang w:val="en-US"/>
+        </w:rPr>
+        <w:t>This was scrapped due to time constraints but could be implemented with a few more days’ work.</w:t>
+      </w:r>
+    </w:p>
+    <w:p>
+      <w:pPr>
+        <w:jc w:val="both"/>
+        <w:rPr>
+          <w:rFonts w:ascii="Times New Roman" w:hAnsi="Times New Roman" w:cs="Times New Roman"/>
+          <w:sz w:val="24"/>
+          <w:szCs w:val="24"/>
+          <w:lang w:val="en-US"/>
+        </w:rPr>
+      </w:pPr>
+      <w:r>
+        <w:rPr>
+          <w:rFonts w:ascii="Times New Roman" w:hAnsi="Times New Roman" w:cs="Times New Roman"/>
+          <w:sz w:val="24"/>
+          <w:szCs w:val="24"/>
+          <w:lang w:val="en-US"/>
+        </w:rPr>
+        <w:t>Small bonus passive changes to character and ability through smaller steps in gameplay</w:t>
+      </w:r>
+      <w:r>
+        <w:rPr>
+          <w:rFonts w:ascii="Times New Roman" w:hAnsi="Times New Roman" w:cs="Times New Roman"/>
+          <w:sz w:val="24"/>
+          <w:szCs w:val="24"/>
+          <w:lang w:val="en-US"/>
+        </w:rPr>
+        <w:t xml:space="preserve">. </w:t>
+      </w:r>
+      <w:r>
+        <w:rPr>
+          <w:rFonts w:ascii="Times New Roman" w:hAnsi="Times New Roman" w:cs="Times New Roman"/>
+          <w:sz w:val="24"/>
+          <w:szCs w:val="24"/>
+          <w:lang w:val="en-US"/>
+        </w:rPr>
+        <w:t>These can be added to by simply changing the file passives.csv in the game files! Though it is worth noting more advanced passives like “Dice” requires changing code in the Player class</w:t>
+      </w:r>
+    </w:p>
+    <w:p>
+      <w:pPr>
+        <w:jc w:val="both"/>
+        <w:rPr>
+          <w:rFonts w:ascii="Times New Roman" w:hAnsi="Times New Roman" w:cs="Times New Roman"/>
+          <w:sz w:val="24"/>
+          <w:szCs w:val="24"/>
+          <w:lang w:val="en-US"/>
+        </w:rPr>
+      </w:pPr>
+    </w:p>
+    <w:p>
+      <w:pPr>
+        <w:jc w:val="both"/>
+        <w:rPr>
+          <w:rFonts w:ascii="Times New Roman" w:hAnsi="Times New Roman" w:cs="Times New Roman"/>
+          <w:sz w:val="24"/>
+          <w:szCs w:val="24"/>
+          <w:lang w:val="en-US"/>
+        </w:rPr>
+      </w:pPr>
+      <w:r>
+        <w:rPr>
+          <w:rFonts w:ascii="Times New Roman" w:hAnsi="Times New Roman" w:cs="Times New Roman"/>
+          <w:sz w:val="24"/>
+          <w:szCs w:val="24"/>
+          <w:lang w:val="en-US"/>
+        </w:rPr>
+        <w:t>A handful of handmade stages to play through.</w:t>
+      </w:r>
+    </w:p>
+    <w:p>
+      <w:pPr>
+        <w:jc w:val="both"/>
+        <w:rPr>
+          <w:rFonts w:ascii="Times New Roman" w:hAnsi="Times New Roman" w:cs="Times New Roman"/>
+          <w:sz w:val="24"/>
+          <w:szCs w:val="24"/>
+          <w:lang w:val="en-US"/>
+        </w:rPr>
+      </w:pPr>
+      <w:r>
+        <w:rPr>
+          <w:rFonts w:ascii="Times New Roman" w:hAnsi="Times New Roman" w:cs="Times New Roman"/>
+          <w:sz w:val="24"/>
+          <w:szCs w:val="24"/>
+          <w:lang w:val="en-US"/>
+        </w:rPr>
+        <w:t>Enemies, tied to the stage progression, which get incrementally harder.</w:t>
+      </w:r>
+      <w:r>
+        <w:rPr>
+          <w:noProof/>
+        </w:rPr>
+        <w:t xml:space="preserve"> </w:t>
       </w:r>
     </w:p>
     <w:p>
@@ -158,23 +469,24 @@
         <w:pStyle w:val="ListParagraph"/>
         <w:numPr>
           <w:ilvl w:val="0"/>
-          <w:numId w:val="2"/>
+          <w:numId w:val="4"/>
         </w:numPr>
-        <w:rPr>
-          <w:rFonts w:ascii="Times New Roman" w:hAnsi="Times New Roman" w:cs="Times New Roman"/>
-          <w:sz w:val="24"/>
-          <w:szCs w:val="24"/>
-          <w:lang w:val="en-US"/>
-        </w:rPr>
-      </w:pPr>
-      <w:r>
-        <w:rPr>
-          <w:rFonts w:ascii="Times New Roman" w:hAnsi="Times New Roman" w:cs="Times New Roman"/>
-          <w:sz w:val="24"/>
-          <w:szCs w:val="24"/>
-          <w:lang w:val="en-US"/>
-        </w:rPr>
-        <w:t>3 skills earned through progression through the game, chosen from a set of options, activated through Z, X, C</w:t>
+        <w:jc w:val="both"/>
+        <w:rPr>
+          <w:rFonts w:ascii="Times New Roman" w:hAnsi="Times New Roman" w:cs="Times New Roman"/>
+          <w:sz w:val="24"/>
+          <w:szCs w:val="24"/>
+          <w:lang w:val="en-US"/>
+        </w:rPr>
+      </w:pPr>
+      <w:r>
+        <w:rPr>
+          <w:rFonts w:ascii="Times New Roman" w:hAnsi="Times New Roman" w:cs="Times New Roman"/>
+          <w:sz w:val="24"/>
+          <w:szCs w:val="24"/>
+          <w:lang w:val="en-US"/>
+        </w:rPr>
+        <w:t>We will start with a simple enemy with an ai that resembles a Terraria zombie, jumping if the player is above them, but otherwise just moving towards the player</w:t>
       </w:r>
     </w:p>
     <w:p>
@@ -182,23 +494,24 @@
         <w:pStyle w:val="ListParagraph"/>
         <w:numPr>
           <w:ilvl w:val="0"/>
-          <w:numId w:val="2"/>
+          <w:numId w:val="4"/>
         </w:numPr>
-        <w:rPr>
-          <w:rFonts w:ascii="Times New Roman" w:hAnsi="Times New Roman" w:cs="Times New Roman"/>
-          <w:sz w:val="24"/>
-          <w:szCs w:val="24"/>
-          <w:lang w:val="en-US"/>
-        </w:rPr>
-      </w:pPr>
-      <w:r>
-        <w:rPr>
-          <w:rFonts w:ascii="Times New Roman" w:hAnsi="Times New Roman" w:cs="Times New Roman"/>
-          <w:sz w:val="24"/>
-          <w:szCs w:val="24"/>
-          <w:lang w:val="en-US"/>
-        </w:rPr>
-        <w:t>Small bonus passive changes to character and ability through smaller steps in gameplay</w:t>
+        <w:jc w:val="both"/>
+        <w:rPr>
+          <w:rFonts w:ascii="Times New Roman" w:hAnsi="Times New Roman" w:cs="Times New Roman"/>
+          <w:sz w:val="24"/>
+          <w:szCs w:val="24"/>
+          <w:lang w:val="en-US"/>
+        </w:rPr>
+      </w:pPr>
+      <w:r>
+        <w:rPr>
+          <w:rFonts w:ascii="Times New Roman" w:hAnsi="Times New Roman" w:cs="Times New Roman"/>
+          <w:sz w:val="24"/>
+          <w:szCs w:val="24"/>
+          <w:lang w:val="en-US"/>
+        </w:rPr>
+        <w:t>Then we will show a bat enemy, which forces the player to keep moving instead of just standing in the middle. The bat moves very quickly up or down, so you have to strafe or elevate yourself to slow them down and shoot them and avoid damage.</w:t>
       </w:r>
     </w:p>
     <w:p>
@@ -206,41 +519,24 @@
         <w:pStyle w:val="ListParagraph"/>
         <w:numPr>
           <w:ilvl w:val="0"/>
-          <w:numId w:val="2"/>
+          <w:numId w:val="4"/>
         </w:numPr>
-        <w:rPr>
-          <w:rFonts w:ascii="Times New Roman" w:hAnsi="Times New Roman" w:cs="Times New Roman"/>
-          <w:sz w:val="24"/>
-          <w:szCs w:val="24"/>
-          <w:lang w:val="en-US"/>
-        </w:rPr>
-      </w:pPr>
-      <w:r>
-        <w:rPr>
-          <w:rFonts w:ascii="Times New Roman" w:hAnsi="Times New Roman" w:cs="Times New Roman"/>
-          <w:sz w:val="24"/>
-          <w:szCs w:val="24"/>
-          <w:lang w:val="en-US"/>
-        </w:rPr>
-        <w:t>Two modes of vertical movement: A jump, and a grapple. The grapple will resemble a swing from a rope to connected to specific points. Jump will follow convention with Space</w:t>
-      </w:r>
-      <w:r>
-        <w:rPr>
-          <w:rFonts w:ascii="Times New Roman" w:hAnsi="Times New Roman" w:cs="Times New Roman"/>
-          <w:sz w:val="24"/>
-          <w:szCs w:val="24"/>
-          <w:lang w:val="en-US"/>
-        </w:rPr>
-        <w:t xml:space="preserve"> or W</w:t>
-      </w:r>
-      <w:r>
-        <w:rPr>
-          <w:rFonts w:ascii="Times New Roman" w:hAnsi="Times New Roman" w:cs="Times New Roman"/>
-          <w:sz w:val="24"/>
-          <w:szCs w:val="24"/>
-          <w:lang w:val="en-US"/>
-        </w:rPr>
-        <w:t>, while the Grapple will require a right mouse button click, with a jump or attack cancelling the swing. I want the player to have to choose when they swing for a burst of movement or when they attack.</w:t>
+        <w:jc w:val="both"/>
+        <w:rPr>
+          <w:rFonts w:ascii="Times New Roman" w:hAnsi="Times New Roman" w:cs="Times New Roman"/>
+          <w:sz w:val="24"/>
+          <w:szCs w:val="24"/>
+          <w:lang w:val="en-US"/>
+        </w:rPr>
+      </w:pPr>
+      <w:r>
+        <w:rPr>
+          <w:rFonts w:ascii="Times New Roman" w:hAnsi="Times New Roman" w:cs="Times New Roman"/>
+          <w:sz w:val="24"/>
+          <w:szCs w:val="24"/>
+          <w:lang w:val="en-US"/>
+        </w:rPr>
+        <w:t>A wizard serves a similar danger as the bat, shooting high-damage projectiles at the player, forcing them to dodge, or intentionally take damage from something else to avoid the projectile, but the wizards stand completely still and have low health, making them an easy target if you can get near.</w:t>
       </w:r>
     </w:p>
     <w:p>
@@ -248,32 +544,122 @@
         <w:pStyle w:val="ListParagraph"/>
         <w:numPr>
           <w:ilvl w:val="0"/>
-          <w:numId w:val="2"/>
+          <w:numId w:val="4"/>
         </w:numPr>
-        <w:rPr>
-          <w:rFonts w:ascii="Times New Roman" w:hAnsi="Times New Roman" w:cs="Times New Roman"/>
-          <w:sz w:val="24"/>
-          <w:szCs w:val="24"/>
-          <w:lang w:val="en-US"/>
-        </w:rPr>
-      </w:pPr>
-      <w:r>
-        <w:rPr>
-          <w:rFonts w:ascii="Times New Roman" w:hAnsi="Times New Roman" w:cs="Times New Roman"/>
-          <w:sz w:val="24"/>
-          <w:szCs w:val="24"/>
-          <w:lang w:val="en-US"/>
-        </w:rPr>
-        <w:t>A handful of created stages</w:t>
-      </w:r>
-      <w:r>
-        <w:rPr>
-          <w:rFonts w:ascii="Times New Roman" w:hAnsi="Times New Roman" w:cs="Times New Roman"/>
-          <w:sz w:val="24"/>
-          <w:szCs w:val="24"/>
-          <w:lang w:val="en-US"/>
-        </w:rPr>
-        <w:t>, random may prove easier, or harder, I’m not sure. Either way, having a couple stages to progress through would be a good idea to allow for a change in appearance.</w:t>
+        <w:jc w:val="both"/>
+        <w:rPr>
+          <w:rFonts w:ascii="Times New Roman" w:hAnsi="Times New Roman" w:cs="Times New Roman"/>
+          <w:sz w:val="24"/>
+          <w:szCs w:val="24"/>
+          <w:lang w:val="en-US"/>
+        </w:rPr>
+      </w:pPr>
+      <w:r>
+        <w:rPr>
+          <w:rFonts w:ascii="Times New Roman" w:hAnsi="Times New Roman" w:cs="Times New Roman"/>
+          <w:sz w:val="24"/>
+          <w:szCs w:val="24"/>
+          <w:lang w:val="en-US"/>
+        </w:rPr>
+        <w:drawing>
+          <wp:anchor distT="0" distB="0" distL="114300" distR="114300" simplePos="0" relativeHeight="251660288" behindDoc="1" locked="0" layoutInCell="1" allowOverlap="1" wp14:anchorId="19A504D5" wp14:editId="61E620DC">
+            <wp:simplePos x="0" y="0"/>
+            <wp:positionH relativeFrom="margin">
+              <wp:posOffset>2392680</wp:posOffset>
+            </wp:positionH>
+            <wp:positionV relativeFrom="paragraph">
+              <wp:posOffset>8890</wp:posOffset>
+            </wp:positionV>
+            <wp:extent cx="3737610" cy="2430780"/>
+            <wp:effectExtent l="0" t="0" r="0" b="7620"/>
+            <wp:wrapThrough wrapText="bothSides">
+              <wp:wrapPolygon edited="0">
+                <wp:start x="0" y="0"/>
+                <wp:lineTo x="0" y="21498"/>
+                <wp:lineTo x="21468" y="21498"/>
+                <wp:lineTo x="21468" y="0"/>
+                <wp:lineTo x="0" y="0"/>
+              </wp:wrapPolygon>
+            </wp:wrapThrough>
+            <wp:docPr id="592683034" name="Picture 1"/>
+            <wp:cNvGraphicFramePr>
+              <a:graphicFrameLocks xmlns:a="http://schemas.openxmlformats.org/drawingml/2006/main" noChangeAspect="1"/>
+            </wp:cNvGraphicFramePr>
+            <a:graphic xmlns:a="http://schemas.openxmlformats.org/drawingml/2006/main">
+              <a:graphicData uri="http://schemas.openxmlformats.org/drawingml/2006/picture">
+                <pic:pic xmlns:pic="http://schemas.openxmlformats.org/drawingml/2006/picture">
+                  <pic:nvPicPr>
+                    <pic:cNvPr id="592683034" name=""/>
+                    <pic:cNvPicPr/>
+                  </pic:nvPicPr>
+                  <pic:blipFill rotWithShape="1">
+                    <a:blip r:embed="rId7" cstate="print">
+                      <a:extLst>
+                        <a:ext uri="{28A0092B-C50C-407E-A947-70E740481C1C}">
+                          <a14:useLocalDpi xmlns:a14="http://schemas.microsoft.com/office/drawing/2010/main" val="0"/>
+                        </a:ext>
+                      </a:extLst>
+                    </a:blip>
+                    <a:srcRect r="18377"/>
+                    <a:stretch>
+                      <a:fillRect/>
+                    </a:stretch>
+                  </pic:blipFill>
+                  <pic:spPr bwMode="auto">
+                    <a:xfrm>
+                      <a:off x="0" y="0"/>
+                      <a:ext cx="3737610" cy="2430780"/>
+                    </a:xfrm>
+                    <a:prstGeom prst="rect">
+                      <a:avLst/>
+                    </a:prstGeom>
+                    <a:ln>
+                      <a:noFill/>
+                    </a:ln>
+                    <a:extLst>
+                      <a:ext uri="{53640926-AAD7-44D8-BBD7-CCE9431645EC}">
+                        <a14:shadowObscured xmlns:a14="http://schemas.microsoft.com/office/drawing/2010/main"/>
+                      </a:ext>
+                    </a:extLst>
+                  </pic:spPr>
+                </pic:pic>
+              </a:graphicData>
+            </a:graphic>
+            <wp14:sizeRelH relativeFrom="margin">
+              <wp14:pctWidth>0</wp14:pctWidth>
+            </wp14:sizeRelH>
+            <wp14:sizeRelV relativeFrom="margin">
+              <wp14:pctHeight>0</wp14:pctHeight>
+            </wp14:sizeRelV>
+          </wp:anchor>
+        </w:drawing>
+      </w:r>
+      <w:r>
+        <w:rPr>
+          <w:rFonts w:ascii="Times New Roman" w:hAnsi="Times New Roman" w:cs="Times New Roman"/>
+          <w:sz w:val="24"/>
+          <w:szCs w:val="24"/>
+          <w:lang w:val="en-US"/>
+        </w:rPr>
+        <w:t xml:space="preserve">The combination of these serves the ultimate challenge. If you’re down on the ground attacking zombie enemies and wizards, you’re vulnerable to the bats, if </w:t>
+      </w:r>
+      <w:r>
+        <w:rPr>
+          <w:rFonts w:ascii="Times New Roman" w:hAnsi="Times New Roman" w:cs="Times New Roman"/>
+          <w:sz w:val="24"/>
+          <w:szCs w:val="24"/>
+          <w:lang w:val="en-US"/>
+        </w:rPr>
+        <w:t>you’re</w:t>
+      </w:r>
+      <w:r>
+        <w:rPr>
+          <w:rFonts w:ascii="Times New Roman" w:hAnsi="Times New Roman" w:cs="Times New Roman"/>
+          <w:sz w:val="24"/>
+          <w:szCs w:val="24"/>
+          <w:lang w:val="en-US"/>
+        </w:rPr>
+        <w:t xml:space="preserve"> on the platforms attacking bats and avoiding zombies, the wizards will have an easy shot at you.</w:t>
       </w:r>
     </w:p>
     <w:p>
@@ -281,147 +667,234 @@
         <w:pStyle w:val="ListParagraph"/>
         <w:numPr>
           <w:ilvl w:val="0"/>
-          <w:numId w:val="2"/>
+          <w:numId w:val="4"/>
         </w:numPr>
-        <w:rPr>
-          <w:rFonts w:ascii="Times New Roman" w:hAnsi="Times New Roman" w:cs="Times New Roman"/>
-          <w:sz w:val="24"/>
-          <w:szCs w:val="24"/>
-          <w:lang w:val="en-US"/>
-        </w:rPr>
-      </w:pPr>
-      <w:r>
-        <w:rPr>
-          <w:rFonts w:ascii="Times New Roman" w:hAnsi="Times New Roman" w:cs="Times New Roman"/>
-          <w:sz w:val="24"/>
-          <w:szCs w:val="24"/>
-          <w:lang w:val="en-US"/>
-        </w:rPr>
-        <w:t>Enemies, which should be tied to the progression of the character. However, I don’t want the enemies to simply get stronger and tougher. I think it would be more fun if instead the enemies got faster and more abundant, making the player use their abilities to manage a horde of enemies through the state instead of just shooting them more (if they didn’t choose abilities or passives well)</w:t>
-      </w:r>
-    </w:p>
-    <w:p>
-      <w:pPr>
-        <w:pStyle w:val="ListParagraph"/>
-        <w:numPr>
-          <w:ilvl w:val="1"/>
-          <w:numId w:val="2"/>
-        </w:numPr>
-        <w:rPr>
-          <w:rFonts w:ascii="Times New Roman" w:hAnsi="Times New Roman" w:cs="Times New Roman"/>
-          <w:sz w:val="24"/>
-          <w:szCs w:val="24"/>
-          <w:lang w:val="en-US"/>
-        </w:rPr>
-      </w:pPr>
-      <w:r>
-        <w:rPr>
-          <w:rFonts w:ascii="Times New Roman" w:hAnsi="Times New Roman" w:cs="Times New Roman"/>
-          <w:sz w:val="24"/>
-          <w:szCs w:val="24"/>
-          <w:lang w:val="en-US"/>
-        </w:rPr>
-        <w:t>Enemies should be able to move like the player, except for the grapple. Having some enemies be able to jump further and move faster than the player can create an aspect of skill expression like in RoR and RoR2, where choosing which enemy is a priority target is an important skill.</w:t>
-      </w:r>
-    </w:p>
-    <w:p>
-      <w:pPr>
-        <w:pStyle w:val="ListParagraph"/>
-        <w:numPr>
-          <w:ilvl w:val="1"/>
-          <w:numId w:val="2"/>
-        </w:numPr>
-        <w:rPr>
-          <w:rFonts w:ascii="Times New Roman" w:hAnsi="Times New Roman" w:cs="Times New Roman"/>
-          <w:sz w:val="24"/>
-          <w:szCs w:val="24"/>
-          <w:lang w:val="en-US"/>
-        </w:rPr>
-      </w:pPr>
-      <w:r>
-        <w:rPr>
-          <w:rFonts w:ascii="Times New Roman" w:hAnsi="Times New Roman" w:cs="Times New Roman"/>
-          <w:sz w:val="24"/>
-          <w:szCs w:val="24"/>
-          <w:lang w:val="en-US"/>
-        </w:rPr>
-        <w:t xml:space="preserve">Having enemies that shoot projectiles or limit where the player can move is another idea I have had, like some enemies in Dead Cells. In a small level this could get </w:t>
-      </w:r>
-      <w:r>
-        <w:rPr>
-          <w:rFonts w:ascii="Times New Roman" w:hAnsi="Times New Roman" w:cs="Times New Roman"/>
-          <w:i/>
-          <w:iCs/>
-          <w:sz w:val="24"/>
-          <w:szCs w:val="24"/>
-          <w:lang w:val="en-US"/>
-        </w:rPr>
-        <w:t>really</w:t>
-      </w:r>
-      <w:r>
-        <w:t xml:space="preserve"> annoying though, so I will only implement and test this if I have time.</w:t>
-      </w:r>
-    </w:p>
-    <w:p>
-      <w:pPr>
-        <w:pStyle w:val="ListParagraph"/>
-        <w:numPr>
-          <w:ilvl w:val="1"/>
-          <w:numId w:val="2"/>
-        </w:numPr>
-        <w:rPr>
-          <w:rFonts w:ascii="Times New Roman" w:hAnsi="Times New Roman" w:cs="Times New Roman"/>
-          <w:sz w:val="24"/>
-          <w:szCs w:val="24"/>
-          <w:lang w:val="en-US"/>
-        </w:rPr>
-      </w:pPr>
-      <w:r>
-        <w:t>The enemies that move will have a very simple AI, like a zombie in Terraria. Jumping when the player is above them and moving towards the player.</w:t>
-      </w:r>
-    </w:p>
-    <w:p>
-      <w:pPr>
-        <w:pStyle w:val="ListParagraph"/>
-        <w:numPr>
-          <w:ilvl w:val="0"/>
-          <w:numId w:val="2"/>
-        </w:numPr>
-        <w:rPr>
-          <w:rFonts w:ascii="Times New Roman" w:hAnsi="Times New Roman" w:cs="Times New Roman"/>
-          <w:sz w:val="24"/>
-          <w:szCs w:val="24"/>
-          <w:lang w:val="en-US"/>
-        </w:rPr>
-      </w:pPr>
-      <w:r>
-        <w:rPr>
-          <w:rFonts w:ascii="Times New Roman" w:hAnsi="Times New Roman" w:cs="Times New Roman"/>
-          <w:sz w:val="24"/>
-          <w:szCs w:val="24"/>
-          <w:lang w:val="en-US"/>
-        </w:rPr>
-        <w:t>I would like the game to have a boss at the end. Maybe a couple that rotates which you fight if I can find the time.</w:t>
-      </w:r>
-    </w:p>
-    <w:p>
-      <w:pPr>
-        <w:rPr>
-          <w:rFonts w:ascii="Times New Roman" w:hAnsi="Times New Roman" w:cs="Times New Roman"/>
-          <w:sz w:val="24"/>
-          <w:szCs w:val="24"/>
-          <w:lang w:val="en-US"/>
-        </w:rPr>
-      </w:pPr>
-      <w:r>
-        <w:rPr>
-          <w:rFonts w:ascii="Times New Roman" w:hAnsi="Times New Roman" w:cs="Times New Roman"/>
-          <w:sz w:val="24"/>
-          <w:szCs w:val="24"/>
-          <w:u w:val="single"/>
-          <w:lang w:val="en-US"/>
-        </w:rPr>
-        <w:t>Theme:</w:t>
+        <w:jc w:val="both"/>
+        <w:rPr>
+          <w:rFonts w:ascii="Times New Roman" w:hAnsi="Times New Roman" w:cs="Times New Roman"/>
+          <w:sz w:val="24"/>
+          <w:szCs w:val="24"/>
+          <w:lang w:val="en-US"/>
+        </w:rPr>
+      </w:pPr>
+      <w:r>
+        <w:rPr>
+          <w:rFonts w:ascii="Times New Roman" w:hAnsi="Times New Roman" w:cs="Times New Roman"/>
+          <w:sz w:val="24"/>
+          <w:szCs w:val="24"/>
+          <w:lang w:val="en-US"/>
+        </w:rPr>
+        <w:t>All enemies are implemented through the new Enemy class, which makes adding new enemies relatively easy.</w:t>
+      </w:r>
+    </w:p>
+    <w:p>
+      <w:pPr>
+        <w:jc w:val="both"/>
+        <w:rPr>
+          <w:rFonts w:ascii="Times New Roman" w:hAnsi="Times New Roman" w:cs="Times New Roman"/>
+          <w:sz w:val="24"/>
+          <w:szCs w:val="24"/>
+          <w:lang w:val="en-US"/>
+        </w:rPr>
+      </w:pPr>
+      <w:r>
+        <w:rPr>
+          <w:rFonts w:ascii="Times New Roman" w:hAnsi="Times New Roman" w:cs="Times New Roman"/>
+          <w:sz w:val="24"/>
+          <w:szCs w:val="24"/>
+          <w:lang w:val="en-US"/>
+        </w:rPr>
+        <w:t>Optimization</w:t>
+      </w:r>
+      <w:r>
+        <w:rPr>
+          <w:rFonts w:ascii="Times New Roman" w:hAnsi="Times New Roman" w:cs="Times New Roman"/>
+          <w:sz w:val="24"/>
+          <w:szCs w:val="24"/>
+          <w:lang w:val="en-US"/>
+        </w:rPr>
+        <w:t>, a</w:t>
+      </w:r>
+      <w:r>
+        <w:rPr>
+          <w:rFonts w:ascii="Times New Roman" w:hAnsi="Times New Roman" w:cs="Times New Roman"/>
+          <w:sz w:val="24"/>
+          <w:szCs w:val="24"/>
+          <w:lang w:val="en-US"/>
+        </w:rPr>
+        <w:t>lthough not seen by the player when done right, I had to change a lot of Viewer</w:t>
+      </w:r>
+      <w:r>
+        <w:rPr>
+          <w:rFonts w:ascii="Times New Roman" w:hAnsi="Times New Roman" w:cs="Times New Roman"/>
+          <w:sz w:val="24"/>
+          <w:szCs w:val="24"/>
+          <w:lang w:val="en-US"/>
+        </w:rPr>
+        <w:t>, Model, and MainWindow to make the game run smoothly.</w:t>
+      </w:r>
+    </w:p>
+    <w:p>
+      <w:pPr>
+        <w:jc w:val="both"/>
+        <w:rPr>
+          <w:rFonts w:ascii="Times New Roman" w:hAnsi="Times New Roman" w:cs="Times New Roman"/>
+          <w:sz w:val="24"/>
+          <w:szCs w:val="24"/>
+          <w:lang w:val="en-US"/>
+        </w:rPr>
+      </w:pPr>
+      <w:r>
+        <w:rPr>
+          <w:rFonts w:ascii="Times New Roman" w:hAnsi="Times New Roman" w:cs="Times New Roman"/>
+          <w:sz w:val="24"/>
+          <w:szCs w:val="24"/>
+          <w:lang w:val="en-US"/>
+        </w:rPr>
+        <w:t>Win and Loss menus</w:t>
+      </w:r>
+      <w:r>
+        <w:rPr>
+          <w:rFonts w:ascii="Times New Roman" w:hAnsi="Times New Roman" w:cs="Times New Roman"/>
+          <w:sz w:val="24"/>
+          <w:szCs w:val="24"/>
+          <w:lang w:val="en-US"/>
+        </w:rPr>
+        <w:t>, w</w:t>
+      </w:r>
+      <w:r>
+        <w:rPr>
+          <w:rFonts w:ascii="Times New Roman" w:hAnsi="Times New Roman" w:cs="Times New Roman"/>
+          <w:sz w:val="24"/>
+          <w:szCs w:val="24"/>
+          <w:lang w:val="en-US"/>
+        </w:rPr>
+        <w:t>hich are able to prompt the player to “Play Again?” or “Quit Game?” like any good loss screen.</w:t>
+      </w:r>
+    </w:p>
+    <w:p>
+      <w:pPr>
+        <w:jc w:val="center"/>
+        <w:rPr>
+          <w:rFonts w:ascii="Times New Roman" w:hAnsi="Times New Roman" w:cs="Times New Roman"/>
+          <w:sz w:val="24"/>
+          <w:szCs w:val="24"/>
+          <w:lang w:val="en-US"/>
+        </w:rPr>
+      </w:pPr>
+      <w:r>
+        <w:rPr>
+          <w:rFonts w:ascii="Times New Roman" w:hAnsi="Times New Roman" w:cs="Times New Roman"/>
+          <w:sz w:val="24"/>
+          <w:szCs w:val="24"/>
+          <w:lang w:val="en-US"/>
+        </w:rPr>
+        <w:t>Keys:</w:t>
+      </w:r>
+    </w:p>
+    <w:p>
+      <w:pPr>
+        <w:rPr>
+          <w:rFonts w:ascii="Times New Roman" w:hAnsi="Times New Roman" w:cs="Times New Roman"/>
+          <w:sz w:val="24"/>
+          <w:szCs w:val="24"/>
+          <w:lang w:val="en-US"/>
+        </w:rPr>
+      </w:pPr>
+      <w:r>
+        <w:rPr>
+          <w:rFonts w:ascii="Times New Roman" w:hAnsi="Times New Roman" w:cs="Times New Roman"/>
+          <w:sz w:val="24"/>
+          <w:szCs w:val="24"/>
+          <w:lang w:val="en-US"/>
+        </w:rPr>
+        <w:t>W: Jump</w:t>
+      </w:r>
+    </w:p>
+    <w:p>
+      <w:pPr>
+        <w:rPr>
+          <w:rFonts w:ascii="Times New Roman" w:hAnsi="Times New Roman" w:cs="Times New Roman"/>
+          <w:sz w:val="24"/>
+          <w:szCs w:val="24"/>
+          <w:lang w:val="en-US"/>
+        </w:rPr>
+      </w:pPr>
+      <w:r>
+        <w:rPr>
+          <w:rFonts w:ascii="Times New Roman" w:hAnsi="Times New Roman" w:cs="Times New Roman"/>
+          <w:sz w:val="24"/>
+          <w:szCs w:val="24"/>
+          <w:lang w:val="en-US"/>
+        </w:rPr>
+        <w:t>A: Move left</w:t>
+      </w:r>
+    </w:p>
+    <w:p>
+      <w:pPr>
+        <w:rPr>
+          <w:rFonts w:ascii="Times New Roman" w:hAnsi="Times New Roman" w:cs="Times New Roman"/>
+          <w:sz w:val="24"/>
+          <w:szCs w:val="24"/>
+          <w:lang w:val="en-US"/>
+        </w:rPr>
+      </w:pPr>
+      <w:r>
+        <w:rPr>
+          <w:rFonts w:ascii="Times New Roman" w:hAnsi="Times New Roman" w:cs="Times New Roman"/>
+          <w:sz w:val="24"/>
+          <w:szCs w:val="24"/>
+          <w:lang w:val="en-US"/>
+        </w:rPr>
+        <w:t>D: Move right</w:t>
+      </w:r>
+    </w:p>
+    <w:p>
+      <w:pPr>
+        <w:rPr>
+          <w:rFonts w:ascii="Times New Roman" w:hAnsi="Times New Roman" w:cs="Times New Roman"/>
+          <w:sz w:val="24"/>
+          <w:szCs w:val="24"/>
+          <w:lang w:val="en-US"/>
+        </w:rPr>
+      </w:pPr>
+      <w:r>
+        <w:rPr>
+          <w:rFonts w:ascii="Times New Roman" w:hAnsi="Times New Roman" w:cs="Times New Roman"/>
+          <w:sz w:val="24"/>
+          <w:szCs w:val="24"/>
+          <w:lang w:val="en-US"/>
+        </w:rPr>
+        <w:t>LMB: Attack / click button</w:t>
+      </w:r>
+    </w:p>
+    <w:p>
+      <w:pPr>
+        <w:jc w:val="center"/>
+        <w:rPr>
+          <w:rFonts w:ascii="Times New Roman" w:hAnsi="Times New Roman" w:cs="Times New Roman"/>
+          <w:sz w:val="24"/>
+          <w:szCs w:val="24"/>
+          <w:lang w:val="en-US"/>
+        </w:rPr>
+      </w:pPr>
+      <w:r>
+        <w:rPr>
+          <w:rFonts w:ascii="Times New Roman" w:hAnsi="Times New Roman" w:cs="Times New Roman"/>
+          <w:sz w:val="24"/>
+          <w:szCs w:val="24"/>
+          <w:lang w:val="en-US"/>
+        </w:rPr>
+        <w:t xml:space="preserve">Sprite </w:t>
+      </w:r>
+      <w:r>
+        <w:rPr>
+          <w:rFonts w:ascii="Times New Roman" w:hAnsi="Times New Roman" w:cs="Times New Roman"/>
+          <w:sz w:val="24"/>
+          <w:szCs w:val="24"/>
+          <w:lang w:val="en-US"/>
+        </w:rPr>
+        <w:t>References</w:t>
       </w:r>
     </w:p>
     <w:p>
@@ -441,48 +914,117 @@
           <w:szCs w:val="24"/>
           <w:lang w:val="en-US"/>
         </w:rPr>
-        <w:t xml:space="preserve">With the games similarity to RoR and WvS I am instinctively imagining a grittier style and theme, and the whip / grapple is making me imagine a castlevania-esque attack and character design. </w:t>
-      </w:r>
-    </w:p>
-    <w:p>
-      <w:pPr>
-        <w:rPr>
-          <w:rFonts w:ascii="Times New Roman" w:hAnsi="Times New Roman" w:cs="Times New Roman"/>
-          <w:sz w:val="24"/>
-          <w:szCs w:val="24"/>
-          <w:lang w:val="en-US"/>
-        </w:rPr>
-      </w:pPr>
-      <w:r>
-        <w:rPr>
-          <w:rFonts w:ascii="Times New Roman" w:hAnsi="Times New Roman" w:cs="Times New Roman"/>
-          <w:sz w:val="24"/>
-          <w:szCs w:val="24"/>
-          <w:lang w:val="en-US"/>
-        </w:rPr>
-        <w:br w:type="page"/>
-      </w:r>
-    </w:p>
-    <w:p>
-      <w:pPr>
-        <w:rPr>
-          <w:rFonts w:ascii="Times New Roman" w:hAnsi="Times New Roman" w:cs="Times New Roman"/>
-          <w:sz w:val="24"/>
-          <w:szCs w:val="24"/>
-          <w:lang w:val="en-US"/>
-        </w:rPr>
-      </w:pPr>
-      <w:r>
-        <w:rPr>
-          <w:rFonts w:ascii="Times New Roman" w:hAnsi="Times New Roman" w:cs="Times New Roman"/>
-          <w:sz w:val="24"/>
-          <w:szCs w:val="24"/>
-          <w:u w:val="single"/>
+        <w:t xml:space="preserve">Sword Enemy: </w:t>
+      </w:r>
+      <w:hyperlink r:id="rId8" w:history="1">
+        <w:r>
+          <w:rPr>
+            <w:rStyle w:val="Hyperlink"/>
+            <w:rFonts w:ascii="Times New Roman" w:hAnsi="Times New Roman" w:cs="Times New Roman"/>
+            <w:sz w:val="24"/>
+            <w:szCs w:val="24"/>
+            <w:lang w:val="en-US"/>
+          </w:rPr>
+          <w:t>https://immortal-burrito.itch.io/blood-demons</w:t>
+        </w:r>
+      </w:hyperlink>
+    </w:p>
+    <w:p>
+      <w:pPr>
+        <w:ind w:left="720"/>
+        <w:rPr>
+          <w:rFonts w:ascii="Times New Roman" w:hAnsi="Times New Roman" w:cs="Times New Roman"/>
+          <w:sz w:val="24"/>
+          <w:szCs w:val="24"/>
+          <w:lang w:val="en-US"/>
+        </w:rPr>
+      </w:pPr>
+      <w:r>
+        <w:rPr>
+          <w:rFonts w:ascii="Times New Roman" w:hAnsi="Times New Roman" w:cs="Times New Roman"/>
+          <w:sz w:val="24"/>
+          <w:szCs w:val="24"/>
+          <w:lang w:val="en-US"/>
+        </w:rPr>
+        <w:t xml:space="preserve">Bat Enemy: </w:t>
+      </w:r>
+      <w:hyperlink r:id="rId9" w:history="1">
+        <w:r>
+          <w:rPr>
+            <w:rStyle w:val="Hyperlink"/>
+            <w:rFonts w:ascii="Times New Roman" w:hAnsi="Times New Roman" w:cs="Times New Roman"/>
+            <w:sz w:val="24"/>
+            <w:szCs w:val="24"/>
+            <w:lang w:val="en-US"/>
+          </w:rPr>
+          <w:t>https://dustdfg.itch.io/pixel-art-bat-1bit</w:t>
+        </w:r>
+      </w:hyperlink>
+    </w:p>
+    <w:p>
+      <w:pPr>
+        <w:ind w:left="720"/>
+        <w:rPr>
+          <w:rFonts w:ascii="Times New Roman" w:hAnsi="Times New Roman" w:cs="Times New Roman"/>
+          <w:sz w:val="24"/>
+          <w:szCs w:val="24"/>
+          <w:lang w:val="en-US"/>
+        </w:rPr>
+      </w:pPr>
+      <w:r>
+        <w:rPr>
+          <w:rFonts w:ascii="Times New Roman" w:hAnsi="Times New Roman" w:cs="Times New Roman"/>
+          <w:sz w:val="24"/>
+          <w:szCs w:val="24"/>
+          <w:lang w:val="en-US"/>
+        </w:rPr>
+        <w:t xml:space="preserve">Boss Enemy: </w:t>
+      </w:r>
+      <w:hyperlink r:id="rId10" w:history="1">
+        <w:r>
+          <w:rPr>
+            <w:rStyle w:val="Hyperlink"/>
+            <w:rFonts w:ascii="Times New Roman" w:hAnsi="Times New Roman" w:cs="Times New Roman"/>
+            <w:sz w:val="24"/>
+            <w:szCs w:val="24"/>
+            <w:lang w:val="en-US"/>
+          </w:rPr>
+          <w:t>https://ozanoyunbozan.itch.io/pixel-art-hooded-knight</w:t>
+        </w:r>
+      </w:hyperlink>
+    </w:p>
+    <w:p>
+      <w:pPr>
+        <w:ind w:left="720"/>
+        <w:rPr>
+          <w:rFonts w:ascii="Times New Roman" w:hAnsi="Times New Roman" w:cs="Times New Roman"/>
+          <w:sz w:val="24"/>
+          <w:szCs w:val="24"/>
+          <w:lang w:val="en-US"/>
+        </w:rPr>
+      </w:pPr>
+      <w:r>
+        <w:rPr>
+          <w:rFonts w:ascii="Times New Roman" w:hAnsi="Times New Roman" w:cs="Times New Roman"/>
+          <w:sz w:val="24"/>
+          <w:szCs w:val="24"/>
           <w:lang w:val="en-US"/>
         </w:rPr>
         <w:lastRenderedPageBreak/>
-        <w:t>Changes to template:</w:t>
-      </w:r>
+        <w:t xml:space="preserve">Wizard Enemy: </w:t>
+      </w:r>
+      <w:hyperlink r:id="rId11" w:history="1">
+        <w:r>
+          <w:rPr>
+            <w:rStyle w:val="Hyperlink"/>
+            <w:rFonts w:ascii="Times New Roman" w:hAnsi="Times New Roman" w:cs="Times New Roman"/>
+            <w:sz w:val="24"/>
+            <w:szCs w:val="24"/>
+            <w:lang w:val="en-US"/>
+          </w:rPr>
+          <w:t>https://nightshade777.itch.io/platformer-enemy-grim</w:t>
+        </w:r>
+      </w:hyperlink>
     </w:p>
     <w:p>
       <w:pPr>
@@ -501,32 +1043,180 @@
           <w:szCs w:val="24"/>
           <w:lang w:val="en-US"/>
         </w:rPr>
-        <w:t>In order to make this game, many changes will need to be made to the space invaders template given. In no particular order:</w:t>
-      </w:r>
-    </w:p>
-    <w:p>
-      <w:pPr>
-        <w:pStyle w:val="ListParagraph"/>
-        <w:numPr>
-          <w:ilvl w:val="0"/>
-          <w:numId w:val="2"/>
-        </w:numPr>
-        <w:rPr>
-          <w:rFonts w:ascii="Times New Roman" w:hAnsi="Times New Roman" w:cs="Times New Roman"/>
-          <w:sz w:val="24"/>
-          <w:szCs w:val="24"/>
-          <w:lang w:val="en-US"/>
-        </w:rPr>
-      </w:pPr>
-      <w:r>
-        <w:rPr>
-          <w:rFonts w:ascii="Times New Roman" w:hAnsi="Times New Roman" w:cs="Times New Roman"/>
-          <w:sz w:val="24"/>
-          <w:szCs w:val="24"/>
-          <w:lang w:val="en-US"/>
-        </w:rPr>
-        <w:t>Platforms and ground</w:t>
-      </w:r>
+        <w:t xml:space="preserve">Portal Texture: </w:t>
+      </w:r>
+      <w:hyperlink r:id="rId12" w:history="1">
+        <w:r>
+          <w:rPr>
+            <w:rStyle w:val="Hyperlink"/>
+            <w:rFonts w:ascii="Times New Roman" w:hAnsi="Times New Roman" w:cs="Times New Roman"/>
+            <w:sz w:val="24"/>
+            <w:szCs w:val="24"/>
+            <w:lang w:val="en-US"/>
+          </w:rPr>
+          <w:t>https://pixelnauta.itch.io/pixel-dimensional-portal-32x32</w:t>
+        </w:r>
+      </w:hyperlink>
+    </w:p>
+    <w:p>
+      <w:pPr>
+        <w:ind w:left="720"/>
+        <w:rPr>
+          <w:rFonts w:ascii="Times New Roman" w:hAnsi="Times New Roman" w:cs="Times New Roman"/>
+          <w:sz w:val="24"/>
+          <w:szCs w:val="24"/>
+          <w:lang w:val="en-US"/>
+        </w:rPr>
+      </w:pPr>
+      <w:r>
+        <w:rPr>
+          <w:rFonts w:ascii="Times New Roman" w:hAnsi="Times New Roman" w:cs="Times New Roman"/>
+          <w:sz w:val="24"/>
+          <w:szCs w:val="24"/>
+          <w:lang w:val="en-US"/>
+        </w:rPr>
+        <w:t xml:space="preserve">Backgrounds: </w:t>
+      </w:r>
+      <w:hyperlink r:id="rId13" w:history="1">
+        <w:r>
+          <w:rPr>
+            <w:rStyle w:val="Hyperlink"/>
+            <w:rFonts w:ascii="Times New Roman" w:hAnsi="Times New Roman" w:cs="Times New Roman"/>
+            <w:sz w:val="24"/>
+            <w:szCs w:val="24"/>
+            <w:lang w:val="en-US"/>
+          </w:rPr>
+          <w:t>https://free-game-assets.itch.io/free-sky-with-clouds-background-pixel-art-set</w:t>
+        </w:r>
+      </w:hyperlink>
+    </w:p>
+    <w:p>
+      <w:pPr>
+        <w:ind w:left="720"/>
+        <w:rPr>
+          <w:rFonts w:ascii="Times New Roman" w:hAnsi="Times New Roman" w:cs="Times New Roman"/>
+          <w:sz w:val="24"/>
+          <w:szCs w:val="24"/>
+          <w:lang w:val="en-US"/>
+        </w:rPr>
+      </w:pPr>
+      <w:r>
+        <w:rPr>
+          <w:rFonts w:ascii="Times New Roman" w:hAnsi="Times New Roman" w:cs="Times New Roman"/>
+          <w:sz w:val="24"/>
+          <w:szCs w:val="24"/>
+          <w:lang w:val="en-US"/>
+        </w:rPr>
+        <w:t xml:space="preserve">Boss Spell VFX: </w:t>
+      </w:r>
+      <w:hyperlink r:id="rId14" w:history="1">
+        <w:r>
+          <w:rPr>
+            <w:rStyle w:val="Hyperlink"/>
+            <w:rFonts w:ascii="Times New Roman" w:hAnsi="Times New Roman" w:cs="Times New Roman"/>
+            <w:sz w:val="24"/>
+            <w:szCs w:val="24"/>
+            <w:lang w:val="en-US"/>
+          </w:rPr>
+          <w:t>https://pimen.itch.io/dark-spell-effect</w:t>
+        </w:r>
+      </w:hyperlink>
+    </w:p>
+    <w:p>
+      <w:pPr>
+        <w:ind w:left="720"/>
+        <w:rPr>
+          <w:rFonts w:ascii="Times New Roman" w:hAnsi="Times New Roman" w:cs="Times New Roman"/>
+          <w:sz w:val="24"/>
+          <w:szCs w:val="24"/>
+          <w:lang w:val="en-US"/>
+        </w:rPr>
+      </w:pPr>
+      <w:r>
+        <w:rPr>
+          <w:rFonts w:ascii="Times New Roman" w:hAnsi="Times New Roman" w:cs="Times New Roman"/>
+          <w:sz w:val="24"/>
+          <w:szCs w:val="24"/>
+          <w:lang w:val="en-US"/>
+        </w:rPr>
+        <w:t xml:space="preserve">Tile-set: </w:t>
+      </w:r>
+      <w:hyperlink r:id="rId15" w:history="1">
+        <w:r>
+          <w:rPr>
+            <w:rStyle w:val="Hyperlink"/>
+            <w:rFonts w:ascii="Times New Roman" w:hAnsi="Times New Roman" w:cs="Times New Roman"/>
+            <w:sz w:val="24"/>
+            <w:szCs w:val="24"/>
+            <w:lang w:val="en-US"/>
+          </w:rPr>
+          <w:t>https://trixelized.itch.io/starstring-fields</w:t>
+        </w:r>
+      </w:hyperlink>
+    </w:p>
+    <w:p>
+      <w:pPr>
+        <w:ind w:left="720"/>
+        <w:rPr>
+          <w:rFonts w:ascii="Times New Roman" w:hAnsi="Times New Roman" w:cs="Times New Roman"/>
+          <w:sz w:val="24"/>
+          <w:szCs w:val="24"/>
+          <w:lang w:val="en-US"/>
+        </w:rPr>
+      </w:pPr>
+      <w:r>
+        <w:rPr>
+          <w:rFonts w:ascii="Times New Roman" w:hAnsi="Times New Roman" w:cs="Times New Roman"/>
+          <w:sz w:val="24"/>
+          <w:szCs w:val="24"/>
+          <w:lang w:val="en-US"/>
+        </w:rPr>
+        <w:t xml:space="preserve">Player Character: </w:t>
+      </w:r>
+      <w:hyperlink r:id="rId16" w:history="1">
+        <w:r>
+          <w:rPr>
+            <w:rStyle w:val="Hyperlink"/>
+            <w:rFonts w:ascii="Times New Roman" w:hAnsi="Times New Roman" w:cs="Times New Roman"/>
+            <w:sz w:val="24"/>
+            <w:szCs w:val="24"/>
+            <w:lang w:val="en-US"/>
+          </w:rPr>
+          <w:t>https://luizmelo.itch.io/evil-wizard-3</w:t>
+        </w:r>
+      </w:hyperlink>
+    </w:p>
+    <w:p>
+      <w:pPr>
+        <w:ind w:left="720"/>
+        <w:rPr>
+          <w:rFonts w:ascii="Times New Roman" w:hAnsi="Times New Roman" w:cs="Times New Roman"/>
+          <w:sz w:val="24"/>
+          <w:szCs w:val="24"/>
+          <w:lang w:val="en-US"/>
+        </w:rPr>
+      </w:pPr>
+      <w:r>
+        <w:rPr>
+          <w:rFonts w:ascii="Times New Roman" w:hAnsi="Times New Roman" w:cs="Times New Roman"/>
+          <w:sz w:val="24"/>
+          <w:szCs w:val="24"/>
+          <w:lang w:val="en-US"/>
+        </w:rPr>
+        <w:t xml:space="preserve">Hearts: </w:t>
+      </w:r>
+      <w:hyperlink r:id="rId17" w:history="1">
+        <w:r>
+          <w:rPr>
+            <w:rStyle w:val="Hyperlink"/>
+            <w:rFonts w:ascii="Times New Roman" w:hAnsi="Times New Roman" w:cs="Times New Roman"/>
+            <w:sz w:val="24"/>
+            <w:szCs w:val="24"/>
+            <w:lang w:val="en-US"/>
+          </w:rPr>
+          <w:t>https://atebits.itch.io/health-pack</w:t>
+        </w:r>
+      </w:hyperlink>
       <w:r>
         <w:rPr>
           <w:rFonts w:ascii="Times New Roman" w:hAnsi="Times New Roman" w:cs="Times New Roman"/>
@@ -535,492 +1225,6 @@
           <w:lang w:val="en-US"/>
         </w:rPr>
         <w:t xml:space="preserve"> </w:t>
-      </w:r>
-      <w:r>
-        <w:rPr>
-          <w:rFonts w:ascii="Times New Roman" w:hAnsi="Times New Roman" w:cs="Times New Roman"/>
-          <w:sz w:val="24"/>
-          <w:szCs w:val="24"/>
-          <w:lang w:val="en-US"/>
-        </w:rPr>
-        <w:t>- Physics implemented</w:t>
-      </w:r>
-    </w:p>
-    <w:p>
-      <w:pPr>
-        <w:pStyle w:val="ListParagraph"/>
-        <w:numPr>
-          <w:ilvl w:val="0"/>
-          <w:numId w:val="2"/>
-        </w:numPr>
-        <w:rPr>
-          <w:rFonts w:ascii="Times New Roman" w:hAnsi="Times New Roman" w:cs="Times New Roman"/>
-          <w:sz w:val="24"/>
-          <w:szCs w:val="24"/>
-          <w:lang w:val="en-US"/>
-        </w:rPr>
-      </w:pPr>
-      <w:r>
-        <w:rPr>
-          <w:rFonts w:ascii="Times New Roman" w:hAnsi="Times New Roman" w:cs="Times New Roman"/>
-          <w:sz w:val="24"/>
-          <w:szCs w:val="24"/>
-          <w:lang w:val="en-US"/>
-        </w:rPr>
-        <w:t>Player jump and gravity</w:t>
-      </w:r>
-      <w:r>
-        <w:rPr>
-          <w:rFonts w:ascii="Times New Roman" w:hAnsi="Times New Roman" w:cs="Times New Roman"/>
-          <w:sz w:val="24"/>
-          <w:szCs w:val="24"/>
-          <w:lang w:val="en-US"/>
-        </w:rPr>
-        <w:t xml:space="preserve"> </w:t>
-      </w:r>
-      <w:r>
-        <w:rPr>
-          <w:rFonts w:ascii="Times New Roman" w:hAnsi="Times New Roman" w:cs="Times New Roman"/>
-          <w:sz w:val="24"/>
-          <w:szCs w:val="24"/>
-          <w:lang w:val="en-US"/>
-        </w:rPr>
-        <w:t>- Done</w:t>
-      </w:r>
-    </w:p>
-    <w:p>
-      <w:pPr>
-        <w:pStyle w:val="ListParagraph"/>
-        <w:numPr>
-          <w:ilvl w:val="0"/>
-          <w:numId w:val="2"/>
-        </w:numPr>
-        <w:rPr>
-          <w:rFonts w:ascii="Times New Roman" w:hAnsi="Times New Roman" w:cs="Times New Roman"/>
-          <w:sz w:val="24"/>
-          <w:szCs w:val="24"/>
-          <w:lang w:val="en-US"/>
-        </w:rPr>
-      </w:pPr>
-      <w:r>
-        <w:rPr>
-          <w:rFonts w:ascii="Times New Roman" w:hAnsi="Times New Roman" w:cs="Times New Roman"/>
-          <w:sz w:val="24"/>
-          <w:szCs w:val="24"/>
-          <w:lang w:val="en-US"/>
-        </w:rPr>
-        <w:t>Player attacks</w:t>
-      </w:r>
-      <w:r>
-        <w:rPr>
-          <w:rFonts w:ascii="Times New Roman" w:hAnsi="Times New Roman" w:cs="Times New Roman"/>
-          <w:sz w:val="24"/>
-          <w:szCs w:val="24"/>
-          <w:lang w:val="en-US"/>
-        </w:rPr>
-        <w:t xml:space="preserve"> </w:t>
-      </w:r>
-      <w:r>
-        <w:rPr>
-          <w:rFonts w:ascii="Times New Roman" w:hAnsi="Times New Roman" w:cs="Times New Roman"/>
-          <w:sz w:val="24"/>
-          <w:szCs w:val="24"/>
-          <w:lang w:val="en-US"/>
-        </w:rPr>
-        <w:t>-</w:t>
-      </w:r>
-      <w:r>
-        <w:rPr>
-          <w:rFonts w:ascii="Times New Roman" w:hAnsi="Times New Roman" w:cs="Times New Roman"/>
-          <w:sz w:val="24"/>
-          <w:szCs w:val="24"/>
-          <w:lang w:val="en-US"/>
-        </w:rPr>
-        <w:t xml:space="preserve"> Basic implementation</w:t>
-      </w:r>
-    </w:p>
-    <w:p>
-      <w:pPr>
-        <w:pStyle w:val="ListParagraph"/>
-        <w:numPr>
-          <w:ilvl w:val="0"/>
-          <w:numId w:val="2"/>
-        </w:numPr>
-        <w:rPr>
-          <w:rFonts w:ascii="Times New Roman" w:hAnsi="Times New Roman" w:cs="Times New Roman"/>
-          <w:sz w:val="24"/>
-          <w:szCs w:val="24"/>
-          <w:lang w:val="en-US"/>
-        </w:rPr>
-      </w:pPr>
-      <w:r>
-        <w:rPr>
-          <w:rFonts w:ascii="Times New Roman" w:hAnsi="Times New Roman" w:cs="Times New Roman"/>
-          <w:sz w:val="24"/>
-          <w:szCs w:val="24"/>
-          <w:lang w:val="en-US"/>
-        </w:rPr>
-        <w:t>Player grapples</w:t>
-      </w:r>
-      <w:r>
-        <w:rPr>
-          <w:rFonts w:ascii="Times New Roman" w:hAnsi="Times New Roman" w:cs="Times New Roman"/>
-          <w:sz w:val="24"/>
-          <w:szCs w:val="24"/>
-          <w:lang w:val="en-US"/>
-        </w:rPr>
-        <w:t xml:space="preserve"> - Scrapped.</w:t>
-      </w:r>
-    </w:p>
-    <w:p>
-      <w:pPr>
-        <w:pStyle w:val="ListParagraph"/>
-        <w:numPr>
-          <w:ilvl w:val="1"/>
-          <w:numId w:val="2"/>
-        </w:numPr>
-        <w:rPr>
-          <w:rFonts w:ascii="Times New Roman" w:hAnsi="Times New Roman" w:cs="Times New Roman"/>
-          <w:sz w:val="24"/>
-          <w:szCs w:val="24"/>
-          <w:lang w:val="en-US"/>
-        </w:rPr>
-      </w:pPr>
-      <w:r>
-        <w:rPr>
-          <w:rFonts w:ascii="Times New Roman" w:hAnsi="Times New Roman" w:cs="Times New Roman"/>
-          <w:sz w:val="24"/>
-          <w:szCs w:val="24"/>
-          <w:lang w:val="en-US"/>
-        </w:rPr>
-        <w:t>This was taken out, as to implement a proper “swinging” feel would be extremely difficult given the frameworks and systems in use, likely for little contribution to what will be, at best, a ‘meh’ game due to time and resource constraints</w:t>
-      </w:r>
-    </w:p>
-    <w:p>
-      <w:pPr>
-        <w:pStyle w:val="ListParagraph"/>
-        <w:numPr>
-          <w:ilvl w:val="0"/>
-          <w:numId w:val="2"/>
-        </w:numPr>
-        <w:rPr>
-          <w:rFonts w:ascii="Times New Roman" w:hAnsi="Times New Roman" w:cs="Times New Roman"/>
-          <w:sz w:val="24"/>
-          <w:szCs w:val="24"/>
-          <w:lang w:val="en-US"/>
-        </w:rPr>
-      </w:pPr>
-      <w:r>
-        <w:rPr>
-          <w:rFonts w:ascii="Times New Roman" w:hAnsi="Times New Roman" w:cs="Times New Roman"/>
-          <w:sz w:val="24"/>
-          <w:szCs w:val="24"/>
-          <w:lang w:val="en-US"/>
-        </w:rPr>
-        <w:t>Enemy “pathfinding”</w:t>
-      </w:r>
-      <w:r>
-        <w:rPr>
-          <w:rFonts w:ascii="Times New Roman" w:hAnsi="Times New Roman" w:cs="Times New Roman"/>
-          <w:sz w:val="24"/>
-          <w:szCs w:val="24"/>
-          <w:lang w:val="en-US"/>
-        </w:rPr>
-        <w:t xml:space="preserve"> - Basic enemy done</w:t>
-      </w:r>
-    </w:p>
-    <w:p>
-      <w:pPr>
-        <w:pStyle w:val="ListParagraph"/>
-        <w:numPr>
-          <w:ilvl w:val="0"/>
-          <w:numId w:val="2"/>
-        </w:numPr>
-        <w:rPr>
-          <w:rFonts w:ascii="Times New Roman" w:hAnsi="Times New Roman" w:cs="Times New Roman"/>
-          <w:sz w:val="24"/>
-          <w:szCs w:val="24"/>
-          <w:lang w:val="en-US"/>
-        </w:rPr>
-      </w:pPr>
-      <w:r>
-        <w:rPr>
-          <w:rFonts w:ascii="Times New Roman" w:hAnsi="Times New Roman" w:cs="Times New Roman"/>
-          <w:sz w:val="24"/>
-          <w:szCs w:val="24"/>
-          <w:lang w:val="en-US"/>
-        </w:rPr>
-        <w:t>Enemy jump and gravity</w:t>
-      </w:r>
-      <w:r>
-        <w:rPr>
-          <w:rFonts w:ascii="Times New Roman" w:hAnsi="Times New Roman" w:cs="Times New Roman"/>
-          <w:sz w:val="24"/>
-          <w:szCs w:val="24"/>
-          <w:lang w:val="en-US"/>
-        </w:rPr>
-        <w:t xml:space="preserve"> - Implemented</w:t>
-      </w:r>
-    </w:p>
-    <w:p>
-      <w:pPr>
-        <w:pStyle w:val="ListParagraph"/>
-        <w:numPr>
-          <w:ilvl w:val="0"/>
-          <w:numId w:val="2"/>
-        </w:numPr>
-        <w:rPr>
-          <w:rFonts w:ascii="Times New Roman" w:hAnsi="Times New Roman" w:cs="Times New Roman"/>
-          <w:sz w:val="24"/>
-          <w:szCs w:val="24"/>
-          <w:lang w:val="en-US"/>
-        </w:rPr>
-      </w:pPr>
-      <w:r>
-        <w:rPr>
-          <w:rFonts w:ascii="Times New Roman" w:hAnsi="Times New Roman" w:cs="Times New Roman"/>
-          <w:sz w:val="24"/>
-          <w:szCs w:val="24"/>
-          <w:lang w:val="en-US"/>
-        </w:rPr>
-        <w:t>Player passive upgrades</w:t>
-      </w:r>
-    </w:p>
-    <w:p>
-      <w:pPr>
-        <w:pStyle w:val="ListParagraph"/>
-        <w:numPr>
-          <w:ilvl w:val="0"/>
-          <w:numId w:val="2"/>
-        </w:numPr>
-        <w:rPr>
-          <w:rFonts w:ascii="Times New Roman" w:hAnsi="Times New Roman" w:cs="Times New Roman"/>
-          <w:sz w:val="24"/>
-          <w:szCs w:val="24"/>
-          <w:lang w:val="en-US"/>
-        </w:rPr>
-      </w:pPr>
-      <w:r>
-        <w:rPr>
-          <w:rFonts w:ascii="Times New Roman" w:hAnsi="Times New Roman" w:cs="Times New Roman"/>
-          <w:sz w:val="24"/>
-          <w:szCs w:val="24"/>
-          <w:lang w:val="en-US"/>
-        </w:rPr>
-        <w:t>Player active upgrades</w:t>
-      </w:r>
-    </w:p>
-    <w:p>
-      <w:pPr>
-        <w:pStyle w:val="ListParagraph"/>
-        <w:numPr>
-          <w:ilvl w:val="0"/>
-          <w:numId w:val="2"/>
-        </w:numPr>
-        <w:rPr>
-          <w:rFonts w:ascii="Times New Roman" w:hAnsi="Times New Roman" w:cs="Times New Roman"/>
-          <w:sz w:val="24"/>
-          <w:szCs w:val="24"/>
-          <w:lang w:val="en-US"/>
-        </w:rPr>
-      </w:pPr>
-      <w:r>
-        <w:rPr>
-          <w:rFonts w:ascii="Times New Roman" w:hAnsi="Times New Roman" w:cs="Times New Roman"/>
-          <w:sz w:val="24"/>
-          <w:szCs w:val="24"/>
-          <w:lang w:val="en-US"/>
-        </w:rPr>
-        <w:t>World stage progression – A major change</w:t>
-      </w:r>
-    </w:p>
-    <w:p>
-      <w:pPr>
-        <w:pStyle w:val="ListParagraph"/>
-        <w:numPr>
-          <w:ilvl w:val="0"/>
-          <w:numId w:val="2"/>
-        </w:numPr>
-        <w:rPr>
-          <w:rFonts w:ascii="Times New Roman" w:hAnsi="Times New Roman" w:cs="Times New Roman"/>
-          <w:sz w:val="24"/>
-          <w:szCs w:val="24"/>
-          <w:lang w:val="en-US"/>
-        </w:rPr>
-      </w:pPr>
-      <w:r>
-        <w:rPr>
-          <w:rFonts w:ascii="Times New Roman" w:hAnsi="Times New Roman" w:cs="Times New Roman"/>
-          <w:sz w:val="24"/>
-          <w:szCs w:val="24"/>
-          <w:lang w:val="en-US"/>
-        </w:rPr>
-        <w:t>Boss stage and enemy</w:t>
-      </w:r>
-    </w:p>
-    <w:p>
-      <w:pPr>
-        <w:pStyle w:val="ListParagraph"/>
-        <w:numPr>
-          <w:ilvl w:val="0"/>
-          <w:numId w:val="2"/>
-        </w:numPr>
-        <w:rPr>
-          <w:rFonts w:ascii="Times New Roman" w:hAnsi="Times New Roman" w:cs="Times New Roman"/>
-          <w:sz w:val="24"/>
-          <w:szCs w:val="24"/>
-          <w:lang w:val="en-US"/>
-        </w:rPr>
-      </w:pPr>
-      <w:r>
-        <w:rPr>
-          <w:rFonts w:ascii="Times New Roman" w:hAnsi="Times New Roman" w:cs="Times New Roman"/>
-          <w:sz w:val="24"/>
-          <w:szCs w:val="24"/>
-          <w:lang w:val="en-US"/>
-        </w:rPr>
-        <w:t>Appearance and sound changes</w:t>
-      </w:r>
-    </w:p>
-    <w:p>
-      <w:pPr>
-        <w:pStyle w:val="ListParagraph"/>
-        <w:numPr>
-          <w:ilvl w:val="0"/>
-          <w:numId w:val="2"/>
-        </w:numPr>
-        <w:rPr>
-          <w:rFonts w:ascii="Times New Roman" w:hAnsi="Times New Roman" w:cs="Times New Roman"/>
-          <w:sz w:val="24"/>
-          <w:szCs w:val="24"/>
-          <w:lang w:val="en-US"/>
-        </w:rPr>
-      </w:pPr>
-      <w:r>
-        <w:rPr>
-          <w:rFonts w:ascii="Times New Roman" w:hAnsi="Times New Roman" w:cs="Times New Roman"/>
-          <w:sz w:val="24"/>
-          <w:szCs w:val="24"/>
-          <w:lang w:val="en-US"/>
-        </w:rPr>
-        <w:t>Optimization of game features</w:t>
-      </w:r>
-    </w:p>
-    <w:p>
-      <w:pPr>
-        <w:rPr>
-          <w:rFonts w:ascii="Times New Roman" w:hAnsi="Times New Roman" w:cs="Times New Roman"/>
-          <w:sz w:val="24"/>
-          <w:szCs w:val="24"/>
-          <w:u w:val="single"/>
-          <w:lang w:val="en-US"/>
-        </w:rPr>
-      </w:pPr>
-      <w:r>
-        <w:rPr>
-          <w:rFonts w:ascii="Times New Roman" w:hAnsi="Times New Roman" w:cs="Times New Roman"/>
-          <w:sz w:val="24"/>
-          <w:szCs w:val="24"/>
-          <w:u w:val="single"/>
-          <w:lang w:val="en-US"/>
-        </w:rPr>
-        <w:t>Current Steps:</w:t>
-      </w:r>
-    </w:p>
-    <w:p>
-      <w:pPr>
-        <w:pStyle w:val="ListParagraph"/>
-        <w:numPr>
-          <w:ilvl w:val="0"/>
-          <w:numId w:val="2"/>
-        </w:numPr>
-        <w:rPr>
-          <w:rFonts w:ascii="Times New Roman" w:hAnsi="Times New Roman" w:cs="Times New Roman"/>
-          <w:sz w:val="24"/>
-          <w:szCs w:val="24"/>
-          <w:lang w:val="en-US"/>
-        </w:rPr>
-      </w:pPr>
-      <w:r>
-        <w:rPr>
-          <w:rFonts w:ascii="Times New Roman" w:hAnsi="Times New Roman" w:cs="Times New Roman"/>
-          <w:sz w:val="24"/>
-          <w:szCs w:val="24"/>
-          <w:lang w:val="en-US"/>
-        </w:rPr>
-        <w:t>Create methods for special abilities</w:t>
-      </w:r>
-    </w:p>
-    <w:p>
-      <w:pPr>
-        <w:pStyle w:val="ListParagraph"/>
-        <w:numPr>
-          <w:ilvl w:val="0"/>
-          <w:numId w:val="2"/>
-        </w:numPr>
-        <w:rPr>
-          <w:rFonts w:ascii="Times New Roman" w:hAnsi="Times New Roman" w:cs="Times New Roman"/>
-          <w:sz w:val="24"/>
-          <w:szCs w:val="24"/>
-          <w:lang w:val="en-US"/>
-        </w:rPr>
-      </w:pPr>
-      <w:r>
-        <w:rPr>
-          <w:rFonts w:ascii="Times New Roman" w:hAnsi="Times New Roman" w:cs="Times New Roman"/>
-          <w:sz w:val="24"/>
-          <w:szCs w:val="24"/>
-          <w:lang w:val="en-US"/>
-        </w:rPr>
-        <w:t>Create system that adds upgrades to player</w:t>
-      </w:r>
-    </w:p>
-    <w:p>
-      <w:pPr>
-        <w:pStyle w:val="ListParagraph"/>
-        <w:numPr>
-          <w:ilvl w:val="0"/>
-          <w:numId w:val="2"/>
-        </w:numPr>
-        <w:rPr>
-          <w:rFonts w:ascii="Times New Roman" w:hAnsi="Times New Roman" w:cs="Times New Roman"/>
-          <w:sz w:val="24"/>
-          <w:szCs w:val="24"/>
-          <w:lang w:val="en-US"/>
-        </w:rPr>
-      </w:pPr>
-      <w:r>
-        <w:rPr>
-          <w:rFonts w:ascii="Times New Roman" w:hAnsi="Times New Roman" w:cs="Times New Roman"/>
-          <w:sz w:val="24"/>
-          <w:szCs w:val="24"/>
-          <w:lang w:val="en-US"/>
-        </w:rPr>
-        <w:t>Make model call player level-ups</w:t>
-      </w:r>
-    </w:p>
-    <w:p>
-      <w:pPr>
-        <w:pStyle w:val="ListParagraph"/>
-        <w:numPr>
-          <w:ilvl w:val="0"/>
-          <w:numId w:val="2"/>
-        </w:numPr>
-        <w:rPr>
-          <w:rFonts w:ascii="Times New Roman" w:hAnsi="Times New Roman" w:cs="Times New Roman"/>
-          <w:sz w:val="24"/>
-          <w:szCs w:val="24"/>
-          <w:lang w:val="en-US"/>
-        </w:rPr>
-      </w:pPr>
-      <w:r>
-        <w:rPr>
-          <w:rFonts w:ascii="Times New Roman" w:hAnsi="Times New Roman" w:cs="Times New Roman"/>
-          <w:sz w:val="24"/>
-          <w:szCs w:val="24"/>
-          <w:lang w:val="en-US"/>
-        </w:rPr>
-        <w:t>Make viewer or mainwindow show a popup asking between two currently unpicked skills</w:t>
       </w:r>
     </w:p>
     <w:sectPr>
@@ -1036,6 +1240,95 @@
 <file path=word/numbering.xml><?xml version="1.0" encoding="utf-8"?>
 <w:numbering xmlns:wpc="http://schemas.microsoft.com/office/word/2010/wordprocessingCanvas" xmlns:cx="http://schemas.microsoft.com/office/drawing/2014/chartex" xmlns:cx1="http://schemas.microsoft.com/office/drawing/2015/9/8/chartex" xmlns:cx2="http://schemas.microsoft.com/office/drawing/2015/10/21/chartex" xmlns:cx3="http://schemas.microsoft.com/office/drawing/2016/5/9/chartex" xmlns:cx4="http://schemas.microsoft.com/office/drawing/2016/5/10/chartex" xmlns:cx5="http://schemas.microsoft.com/office/drawing/2016/5/11/chartex" xmlns:cx6="http://schemas.microsoft.com/office/drawing/2016/5/12/chartex" xmlns:cx7="http://schemas.microsoft.com/office/drawing/2016/5/13/chartex" xmlns:cx8="http://schemas.microsoft.com/office/drawing/2016/5/14/chartex" xmlns:mc="http://schemas.openxmlformats.org/markup-compatibility/2006" xmlns:aink="http://schemas.microsoft.com/office/drawing/2016/ink" xmlns:am3d="http://schemas.microsoft.com/office/drawing/2017/model3d" xmlns:o="urn:schemas-microsoft-com:office:office" xmlns:oel="http://schemas.microsoft.com/office/2019/extlst" xmlns:r="http://schemas.openxmlformats.org/officeDocument/2006/relationships" xmlns:m="http://schemas.openxmlformats.org/officeDocument/2006/math" xmlns:v="urn:schemas-microsoft-com:vml" xmlns:wp14="http://schemas.microsoft.com/office/word/2010/wordprocessingDrawing" xmlns:wp="http://schemas.openxmlformats.org/drawingml/2006/wordprocessingDrawing" xmlns:w10="urn:schemas-microsoft-com:office:word" xmlns:w="http://schemas.openxmlformats.org/wordprocessingml/2006/main" xmlns:w14="http://schemas.microsoft.com/office/word/2010/wordml" xmlns:w15="http://schemas.microsoft.com/office/word/2012/wordml" xmlns:w16cex="http://schemas.microsoft.com/office/word/2018/wordml/cex" xmlns:w16cid="http://schemas.microsoft.com/office/word/2016/wordml/cid" xmlns:w16="http://schemas.microsoft.com/office/word/2018/wordml" xmlns:w16du="http://schemas.microsoft.com/office/word/2023/wordml/word16du" xmlns:w16sdtdh="http://schemas.microsoft.com/office/word/2020/wordml/sdtdatahash" xmlns:w16sdtfl="http://schemas.microsoft.com/office/word/2024/wordml/sdtformatlock" xmlns:w16se="http://schemas.microsoft.com/office/word/2015/wordml/symex" xmlns:wpg="http://schemas.microsoft.com/office/word/2010/wordprocessingGroup" xmlns:wpi="http://schemas.microsoft.com/office/word/2010/wordprocessingInk" xmlns:wne="http://schemas.microsoft.com/office/word/2006/wordml" xmlns:wps="http://schemas.microsoft.com/office/word/2010/wordprocessingShape" mc:Ignorable="w14 w15 w16se w16cid w16 w16cex w16sdtdh w16sdtfl w16du wp14">
   <w:abstractNum w:abstractNumId="0" w15:restartNumberingAfterBreak="0">
+    <w:nsid w:val="16016303"/>
+    <w:multiLevelType w:val="hybridMultilevel"/>
+    <w:tmpl w:val="D28C0244"/>
+    <w:lvl w:ilvl="0" w:tplc="718801B4">
+      <w:start w:val="2"/>
+      <w:numFmt w:val="decimal"/>
+      <w:lvlText w:val="%1"/>
+      <w:lvlJc w:val="left"/>
+      <w:pPr>
+        <w:ind w:left="720" w:hanging="360"/>
+      </w:pPr>
+      <w:rPr>
+        <w:rFonts w:hint="default"/>
+      </w:rPr>
+    </w:lvl>
+    <w:lvl w:ilvl="1" w:tplc="18090019" w:tentative="1">
+      <w:start w:val="1"/>
+      <w:numFmt w:val="lowerLetter"/>
+      <w:lvlText w:val="%2."/>
+      <w:lvlJc w:val="left"/>
+      <w:pPr>
+        <w:ind w:left="1440" w:hanging="360"/>
+      </w:pPr>
+    </w:lvl>
+    <w:lvl w:ilvl="2" w:tplc="1809001B" w:tentative="1">
+      <w:start w:val="1"/>
+      <w:numFmt w:val="lowerRoman"/>
+      <w:lvlText w:val="%3."/>
+      <w:lvlJc w:val="right"/>
+      <w:pPr>
+        <w:ind w:left="2160" w:hanging="180"/>
+      </w:pPr>
+    </w:lvl>
+    <w:lvl w:ilvl="3" w:tplc="1809000F" w:tentative="1">
+      <w:start w:val="1"/>
+      <w:numFmt w:val="decimal"/>
+      <w:lvlText w:val="%4."/>
+      <w:lvlJc w:val="left"/>
+      <w:pPr>
+        <w:ind w:left="2880" w:hanging="360"/>
+      </w:pPr>
+    </w:lvl>
+    <w:lvl w:ilvl="4" w:tplc="18090019" w:tentative="1">
+      <w:start w:val="1"/>
+      <w:numFmt w:val="lowerLetter"/>
+      <w:lvlText w:val="%5."/>
+      <w:lvlJc w:val="left"/>
+      <w:pPr>
+        <w:ind w:left="3600" w:hanging="360"/>
+      </w:pPr>
+    </w:lvl>
+    <w:lvl w:ilvl="5" w:tplc="1809001B" w:tentative="1">
+      <w:start w:val="1"/>
+      <w:numFmt w:val="lowerRoman"/>
+      <w:lvlText w:val="%6."/>
+      <w:lvlJc w:val="right"/>
+      <w:pPr>
+        <w:ind w:left="4320" w:hanging="180"/>
+      </w:pPr>
+    </w:lvl>
+    <w:lvl w:ilvl="6" w:tplc="1809000F" w:tentative="1">
+      <w:start w:val="1"/>
+      <w:numFmt w:val="decimal"/>
+      <w:lvlText w:val="%7."/>
+      <w:lvlJc w:val="left"/>
+      <w:pPr>
+        <w:ind w:left="5040" w:hanging="360"/>
+      </w:pPr>
+    </w:lvl>
+    <w:lvl w:ilvl="7" w:tplc="18090019" w:tentative="1">
+      <w:start w:val="1"/>
+      <w:numFmt w:val="lowerLetter"/>
+      <w:lvlText w:val="%8."/>
+      <w:lvlJc w:val="left"/>
+      <w:pPr>
+        <w:ind w:left="5760" w:hanging="360"/>
+      </w:pPr>
+    </w:lvl>
+    <w:lvl w:ilvl="8" w:tplc="1809001B" w:tentative="1">
+      <w:start w:val="1"/>
+      <w:numFmt w:val="lowerRoman"/>
+      <w:lvlText w:val="%9."/>
+      <w:lvlJc w:val="right"/>
+      <w:pPr>
+        <w:ind w:left="6480" w:hanging="180"/>
+      </w:pPr>
+    </w:lvl>
+  </w:abstractNum>
+  <w:abstractNum w:abstractNumId="1" w15:restartNumberingAfterBreak="0">
     <w:nsid w:val="192E2EF0"/>
     <w:multiLevelType w:val="hybridMultilevel"/>
     <w:tmpl w:val="1B8AC01C"/>
@@ -1147,7 +1440,119 @@
       </w:rPr>
     </w:lvl>
   </w:abstractNum>
-  <w:abstractNum w:abstractNumId="1" w15:restartNumberingAfterBreak="0">
+  <w:abstractNum w:abstractNumId="2" w15:restartNumberingAfterBreak="0">
+    <w:nsid w:val="1A8A6898"/>
+    <w:multiLevelType w:val="hybridMultilevel"/>
+    <w:tmpl w:val="A4586B4C"/>
+    <w:lvl w:ilvl="0" w:tplc="FFAC0540">
+      <w:numFmt w:val="bullet"/>
+      <w:lvlText w:val="-"/>
+      <w:lvlJc w:val="left"/>
+      <w:pPr>
+        <w:ind w:left="720" w:hanging="360"/>
+      </w:pPr>
+      <w:rPr>
+        <w:rFonts w:ascii="Times New Roman" w:eastAsiaTheme="minorHAnsi" w:hAnsi="Times New Roman" w:cs="Times New Roman" w:hint="default"/>
+      </w:rPr>
+    </w:lvl>
+    <w:lvl w:ilvl="1" w:tplc="18090003" w:tentative="1">
+      <w:start w:val="1"/>
+      <w:numFmt w:val="bullet"/>
+      <w:lvlText w:val="o"/>
+      <w:lvlJc w:val="left"/>
+      <w:pPr>
+        <w:ind w:left="1440" w:hanging="360"/>
+      </w:pPr>
+      <w:rPr>
+        <w:rFonts w:ascii="Courier New" w:hAnsi="Courier New" w:cs="Courier New" w:hint="default"/>
+      </w:rPr>
+    </w:lvl>
+    <w:lvl w:ilvl="2" w:tplc="18090005" w:tentative="1">
+      <w:start w:val="1"/>
+      <w:numFmt w:val="bullet"/>
+      <w:lvlText w:val=""/>
+      <w:lvlJc w:val="left"/>
+      <w:pPr>
+        <w:ind w:left="2160" w:hanging="360"/>
+      </w:pPr>
+      <w:rPr>
+        <w:rFonts w:ascii="Wingdings" w:hAnsi="Wingdings" w:hint="default"/>
+      </w:rPr>
+    </w:lvl>
+    <w:lvl w:ilvl="3" w:tplc="18090001" w:tentative="1">
+      <w:start w:val="1"/>
+      <w:numFmt w:val="bullet"/>
+      <w:lvlText w:val=""/>
+      <w:lvlJc w:val="left"/>
+      <w:pPr>
+        <w:ind w:left="2880" w:hanging="360"/>
+      </w:pPr>
+      <w:rPr>
+        <w:rFonts w:ascii="Symbol" w:hAnsi="Symbol" w:hint="default"/>
+      </w:rPr>
+    </w:lvl>
+    <w:lvl w:ilvl="4" w:tplc="18090003" w:tentative="1">
+      <w:start w:val="1"/>
+      <w:numFmt w:val="bullet"/>
+      <w:lvlText w:val="o"/>
+      <w:lvlJc w:val="left"/>
+      <w:pPr>
+        <w:ind w:left="3600" w:hanging="360"/>
+      </w:pPr>
+      <w:rPr>
+        <w:rFonts w:ascii="Courier New" w:hAnsi="Courier New" w:cs="Courier New" w:hint="default"/>
+      </w:rPr>
+    </w:lvl>
+    <w:lvl w:ilvl="5" w:tplc="18090005" w:tentative="1">
+      <w:start w:val="1"/>
+      <w:numFmt w:val="bullet"/>
+      <w:lvlText w:val=""/>
+      <w:lvlJc w:val="left"/>
+      <w:pPr>
+        <w:ind w:left="4320" w:hanging="360"/>
+      </w:pPr>
+      <w:rPr>
+        <w:rFonts w:ascii="Wingdings" w:hAnsi="Wingdings" w:hint="default"/>
+      </w:rPr>
+    </w:lvl>
+    <w:lvl w:ilvl="6" w:tplc="18090001" w:tentative="1">
+      <w:start w:val="1"/>
+      <w:numFmt w:val="bullet"/>
+      <w:lvlText w:val=""/>
+      <w:lvlJc w:val="left"/>
+      <w:pPr>
+        <w:ind w:left="5040" w:hanging="360"/>
+      </w:pPr>
+      <w:rPr>
+        <w:rFonts w:ascii="Symbol" w:hAnsi="Symbol" w:hint="default"/>
+      </w:rPr>
+    </w:lvl>
+    <w:lvl w:ilvl="7" w:tplc="18090003" w:tentative="1">
+      <w:start w:val="1"/>
+      <w:numFmt w:val="bullet"/>
+      <w:lvlText w:val="o"/>
+      <w:lvlJc w:val="left"/>
+      <w:pPr>
+        <w:ind w:left="5760" w:hanging="360"/>
+      </w:pPr>
+      <w:rPr>
+        <w:rFonts w:ascii="Courier New" w:hAnsi="Courier New" w:cs="Courier New" w:hint="default"/>
+      </w:rPr>
+    </w:lvl>
+    <w:lvl w:ilvl="8" w:tplc="18090005" w:tentative="1">
+      <w:start w:val="1"/>
+      <w:numFmt w:val="bullet"/>
+      <w:lvlText w:val=""/>
+      <w:lvlJc w:val="left"/>
+      <w:pPr>
+        <w:ind w:left="6480" w:hanging="360"/>
+      </w:pPr>
+      <w:rPr>
+        <w:rFonts w:ascii="Wingdings" w:hAnsi="Wingdings" w:hint="default"/>
+      </w:rPr>
+    </w:lvl>
+  </w:abstractNum>
+  <w:abstractNum w:abstractNumId="3" w15:restartNumberingAfterBreak="0">
     <w:nsid w:val="37267679"/>
     <w:multiLevelType w:val="hybridMultilevel"/>
     <w:tmpl w:val="6FEAF7CA"/>
@@ -1259,7 +1664,7 @@
       </w:rPr>
     </w:lvl>
   </w:abstractNum>
-  <w:abstractNum w:abstractNumId="2" w15:restartNumberingAfterBreak="0">
+  <w:abstractNum w:abstractNumId="4" w15:restartNumberingAfterBreak="0">
     <w:nsid w:val="654710CD"/>
     <w:multiLevelType w:val="hybridMultilevel"/>
     <w:tmpl w:val="6F9C2B34"/>
@@ -1373,13 +1778,19 @@
     </w:lvl>
   </w:abstractNum>
   <w:num w:numId="1" w16cid:durableId="1416434656">
+    <w:abstractNumId w:val="3"/>
+  </w:num>
+  <w:num w:numId="2" w16cid:durableId="496699704">
     <w:abstractNumId w:val="1"/>
   </w:num>
-  <w:num w:numId="2" w16cid:durableId="496699704">
+  <w:num w:numId="3" w16cid:durableId="1517421600">
+    <w:abstractNumId w:val="4"/>
+  </w:num>
+  <w:num w:numId="4" w16cid:durableId="238491709">
+    <w:abstractNumId w:val="2"/>
+  </w:num>
+  <w:num w:numId="5" w16cid:durableId="808671696">
     <w:abstractNumId w:val="0"/>
-  </w:num>
-  <w:num w:numId="3" w16cid:durableId="1517421600">
-    <w:abstractNumId w:val="2"/>
   </w:num>
 </w:numbering>
 </file>
@@ -2301,6 +2712,29 @@
       <w:spacing w:val="5"/>
     </w:rPr>
   </w:style>
+  <w:style w:type="character" w:styleId="Hyperlink">
+    <w:name w:val="Hyperlink"/>
+    <w:basedOn w:val="DefaultParagraphFont"/>
+    <w:uiPriority w:val="99"/>
+    <w:unhideWhenUsed/>
+    <w:rsid w:val="00A32D7D"/>
+    <w:rPr>
+      <w:color w:val="467886" w:themeColor="hyperlink"/>
+      <w:u w:val="single"/>
+    </w:rPr>
+  </w:style>
+  <w:style w:type="character" w:styleId="UnresolvedMention">
+    <w:name w:val="Unresolved Mention"/>
+    <w:basedOn w:val="DefaultParagraphFont"/>
+    <w:uiPriority w:val="99"/>
+    <w:semiHidden/>
+    <w:unhideWhenUsed/>
+    <w:rsid w:val="00A32D7D"/>
+    <w:rPr>
+      <w:color w:val="605E5C"/>
+      <w:shd w:val="clear" w:color="auto" w:fill="E1DFDD"/>
+    </w:rPr>
+  </w:style>
 </w:styles>
 </file>
 

</xml_diff>